<commit_message>
Connect Crown Castle credit adjustments to the shared workpaper and deliverables
</commit_message>
<xml_diff>
--- a/examples/crown-castle-2025/deliverables/report.docx
+++ b/examples/crown-castle-2025/deliverables/report.docx
@@ -12,7 +12,7 @@
     </w:p>
     <w:p>
       <w:r>
-        <w:t>2025-01-01 — 2025-12-31　资料截止 2026-06-30　底稿 crown-castle-2025-public-1</w:t>
+        <w:t>2025-01-01 — 2025-12-31　资料截止 2026-06-30　底稿 crown-castle-2025-public-2</w:t>
       </w:r>
     </w:p>
     <w:p>
@@ -43,6 +43,11 @@
     <w:p>
       <w:r>
         <w:t>方法与适用范围：读取出售备考、签署出售协议和新旧信贷定义，将备考假设、实际交割收付及尚未完成的计划分列。</w:t>
+      </w:r>
+    </w:p>
+    <w:p>
+      <w:r>
+        <w:t>方法与适用范围：按S&amp;P Ratios and Adjustments 2025-12-17及Sector-Specific Corporate Methodology 2025-09-26数字基础设施章建立历史调整桥和条件路径；方法代理、实际现金和分析估计分列。</w:t>
       </w:r>
     </w:p>
     <w:p>
@@ -106,6 +111,11 @@
     <w:p>
       <w:r>
         <w:t>公开备考BS假设2025-12-31完成、利润表假设2025-01-01完成，2026-05-01发表；其金额不属于2025已报实数或2026五月实际现金。出售协议后续修订未找到可识别文本，最初签署机制不能视为全部最终条款。</w:t>
+      </w:r>
+    </w:p>
+    <w:p>
+      <w:r>
+        <w:t>S&amp;P桥包含披露支持的最佳估计及局部敏感性；未完成主权/行业、竞争地位、前瞻财务、支持与债项全形成链，不宣告机构级别。</w:t>
       </w:r>
     </w:p>
     <w:p>
@@ -2235,412 +2245,450 @@
         <w:pStyle w:val="Heading1"/>
       </w:pPr>
       <w:r>
-        <w:t>勾稽结果</w:t>
-      </w:r>
-    </w:p>
-    <w:p>
-      <w:r>
-        <w:t>2025 流动资产分项合计 [R_ca_2025]：within_input_tolerance；基础单位残差 0。 原表百万美元列示精度，检验可直接复算桥；阈值以美元计。</w:t>
-      </w:r>
-    </w:p>
-    <w:p>
-      <w:r>
-        <w:t>2025 总资产分项合计 [R_assets_2025]：within_input_tolerance；基础单位残差 0。 原表百万美元列示精度，检验可直接复算桥；阈值以美元计。</w:t>
-      </w:r>
-    </w:p>
-    <w:p>
-      <w:r>
-        <w:t>2025 流动负债分项合计 [R_cl_2025]：within_input_tolerance；基础单位残差 0。 原表百万美元列示精度，检验可直接复算桥；阈值以美元计。</w:t>
-      </w:r>
-    </w:p>
-    <w:p>
-      <w:r>
-        <w:t>2025 总负债分项合计 [R_liab_2025]：within_input_tolerance；基础单位残差 0。 原表百万美元列示精度，检验可直接复算桥；阈值以美元计。</w:t>
-      </w:r>
-    </w:p>
-    <w:p>
-      <w:r>
-        <w:t>2025 权益组成 [R_eqparts_2025]：within_input_tolerance；基础单位残差 0。 原表百万美元列示精度，检验可直接复算桥；阈值以美元计。</w:t>
-      </w:r>
-    </w:p>
-    <w:p>
-      <w:r>
-        <w:t>2025 资产负债恒等式 [R_bs_2025]：within_input_tolerance；基础单位残差 0。 原表百万美元列示精度，检验可直接复算桥；阈值以美元计。</w:t>
-      </w:r>
-    </w:p>
-    <w:p>
-      <w:r>
-        <w:t>2025 持续收入组成 [R_rev_2025]：within_input_tolerance；基础单位残差 0。 原表百万美元列示精度，检验可直接复算桥；阈值以美元计。</w:t>
-      </w:r>
-    </w:p>
-    <w:p>
-      <w:r>
-        <w:t>2025 持续费用组成 [R_opex_2025]：within_input_tolerance；基础单位残差 0。 原表百万美元列示精度，检验可直接复算桥；阈值以美元计。</w:t>
-      </w:r>
-    </w:p>
-    <w:p>
-      <w:r>
-        <w:t>2025 持续税前利润桥 [R_pbt_2025]：within_input_tolerance；基础单位残差 0。 原表百万美元列示精度，检验可直接复算桥；阈值以美元计。</w:t>
-      </w:r>
-    </w:p>
-    <w:p>
-      <w:r>
-        <w:t>2025 持续净利润桥 [R_contni_2025]：within_input_tolerance；基础单位残差 0。 原表百万美元列示精度，检验可直接复算桥；阈值以美元计。</w:t>
-      </w:r>
-    </w:p>
-    <w:p>
-      <w:r>
-        <w:t>2025 持续加终止净利润 [R_net_2025]：within_input_tolerance；基础单位残差 0。 原表百万美元列示精度，检验可直接复算桥；阈值以美元计。</w:t>
-      </w:r>
-    </w:p>
-    <w:p>
-      <w:r>
-        <w:t>2025 综合收益桥 [R_comp_2025]：within_input_tolerance；基础单位残差 0。 原表百万美元列示精度，检验可直接复算桥；阈值以美元计。</w:t>
-      </w:r>
-    </w:p>
-    <w:p>
-      <w:r>
-        <w:t>2025 投资现金流组成 [R_cfi_2025]：within_input_tolerance；基础单位残差 0。 原表百万美元列示精度，检验可直接复算桥；阈值以美元计。</w:t>
-      </w:r>
-    </w:p>
-    <w:p>
-      <w:r>
-        <w:t>2025 融资现金流组成 [R_cff_2025]：within_input_tolerance；基础单位残差 0。 原表百万美元列示精度，检验可直接复算桥；阈值以美元计。</w:t>
-      </w:r>
-    </w:p>
-    <w:p>
-      <w:r>
-        <w:t>2025 三类现金流合计 [R_cashdelta_2025]：within_input_tolerance；基础单位残差 0。 原表百万美元列示精度，检验可直接复算桥；阈值以美元计。</w:t>
-      </w:r>
-    </w:p>
-    <w:p>
-      <w:r>
-        <w:t>2025 终止资产分项 [R_discassets_2025]：within_input_tolerance；基础单位残差 0。 原表百万美元列示精度，检验可直接复算桥；阈值以美元计。</w:t>
-      </w:r>
-    </w:p>
-    <w:p>
-      <w:r>
-        <w:t>2025 终止负债分项 [R_discliab_2025]：within_input_tolerance；基础单位残差 0。 原表百万美元列示精度，检验可直接复算桥；阈值以美元计。</w:t>
-      </w:r>
-    </w:p>
-    <w:p>
-      <w:r>
-        <w:t>2025 终止税前利润桥 [R_discpbt_2025]：within_input_tolerance；基础单位残差 0。 原表百万美元列示精度，检验可直接复算桥；阈值以美元计。</w:t>
-      </w:r>
-    </w:p>
-    <w:p>
-      <w:r>
-        <w:t>2025 终止处置前净利润桥 [R_discpre_2025]：within_input_tolerance；基础单位残差 0。 原表百万美元列示精度，检验可直接复算桥；阈值以美元计。</w:t>
-      </w:r>
-    </w:p>
-    <w:p>
-      <w:r>
-        <w:t>2025 持续税额调节 [R_tax_2025]：within_input_tolerance；基础单位残差 0。 原表百万美元列示精度，检验可直接复算桥；阈值以美元计。</w:t>
-      </w:r>
-    </w:p>
-    <w:p>
-      <w:r>
-        <w:t>2025 持续现金分层 [R_contcash_2025]：within_input_tolerance；基础单位残差 0。 原表百万美元列示精度，检验可直接复算桥；阈值以美元计。</w:t>
-      </w:r>
-    </w:p>
-    <w:p>
-      <w:r>
-        <w:t>2025 终止现金分层 [R_disccash_2025]：within_input_tolerance；基础单位残差 0。 原表百万美元列示精度，检验可直接复算桥；阈值以美元计。</w:t>
-      </w:r>
-    </w:p>
-    <w:p>
-      <w:r>
-        <w:t>2025 全部现金分层 [R_cashall_2025]：within_input_tolerance；基础单位残差 0。 原表百万美元列示精度，检验可直接复算桥；阈值以美元计。</w:t>
-      </w:r>
-    </w:p>
-    <w:p>
-      <w:r>
-        <w:t>2025 持续营业利润 [R_op_2025]：within_input_tolerance；基础单位残差 0。 原表百万美元列示精度，检验可直接复算桥；阈值以美元计。</w:t>
-      </w:r>
-    </w:p>
-    <w:p>
-      <w:r>
-        <w:t>2025 终止净损益 [R_discni_2025]：within_input_tolerance；基础单位残差 0。 原表百万美元列示精度，检验可直接复算桥；阈值以美元计。</w:t>
-      </w:r>
-    </w:p>
-    <w:p>
-      <w:r>
-        <w:t>2025 CFO 全桥 [R_cfo_2025]：within_input_tolerance；基础单位残差 0。 原表百万美元列示精度，检验可直接复算桥；阈值以美元计。</w:t>
-      </w:r>
-    </w:p>
-    <w:p>
-      <w:r>
-        <w:t>2025 现金滚动 [R_cashroll_2025]：within_input_tolerance；基础单位残差 0。 原表百万美元列示精度，检验可直接复算桥；阈值以美元计。</w:t>
-      </w:r>
-    </w:p>
-    <w:p>
-      <w:r>
-        <w:t>2025 权益滚动 [R_eqroll_2025]：within_input_tolerance；基础单位残差 0。 原表百万美元列示精度，检验可直接复算桥；阈值以美元计。</w:t>
-      </w:r>
-    </w:p>
-    <w:p>
-      <w:r>
-        <w:t>2024 流动资产分项合计 [R_ca_2024]：within_input_tolerance；基础单位残差 0。 原表百万美元列示精度，检验可直接复算桥；阈值以美元计。</w:t>
-      </w:r>
-    </w:p>
-    <w:p>
-      <w:r>
-        <w:t>2024 总资产分项合计 [R_assets_2024]：within_input_tolerance；基础单位残差 0。 原表百万美元列示精度，检验可直接复算桥；阈值以美元计。</w:t>
-      </w:r>
-    </w:p>
-    <w:p>
-      <w:r>
-        <w:t>2024 流动负债分项合计 [R_cl_2024]：within_input_tolerance；基础单位残差 0。 原表百万美元列示精度，检验可直接复算桥；阈值以美元计。</w:t>
-      </w:r>
-    </w:p>
-    <w:p>
-      <w:r>
-        <w:t>2024 总负债分项合计 [R_liab_2024]：within_input_tolerance；基础单位残差 0。 原表百万美元列示精度，检验可直接复算桥；阈值以美元计。</w:t>
-      </w:r>
-    </w:p>
-    <w:p>
-      <w:r>
-        <w:t>2024 权益组成 [R_eqparts_2024]：within_input_tolerance；基础单位残差 0。 原表百万美元列示精度，检验可直接复算桥；阈值以美元计。</w:t>
-      </w:r>
-    </w:p>
-    <w:p>
-      <w:r>
-        <w:t>2024 资产负债恒等式 [R_bs_2024]：within_input_tolerance；基础单位残差 0。 原表百万美元列示精度，检验可直接复算桥；阈值以美元计。</w:t>
-      </w:r>
-    </w:p>
-    <w:p>
-      <w:r>
-        <w:t>2024 持续收入组成 [R_rev_2024]：within_input_tolerance；基础单位残差 0。 原表百万美元列示精度，检验可直接复算桥；阈值以美元计。</w:t>
-      </w:r>
-    </w:p>
-    <w:p>
-      <w:r>
-        <w:t>2024 持续费用组成 [R_opex_2024]：within_input_tolerance；基础单位残差 0。 原表百万美元列示精度，检验可直接复算桥；阈值以美元计。</w:t>
-      </w:r>
-    </w:p>
-    <w:p>
-      <w:r>
-        <w:t>2024 持续税前利润桥 [R_pbt_2024]：within_input_tolerance；基础单位残差 0。 原表百万美元列示精度，检验可直接复算桥；阈值以美元计。</w:t>
-      </w:r>
-    </w:p>
-    <w:p>
-      <w:r>
-        <w:t>2024 持续净利润桥 [R_contni_2024]：within_input_tolerance；基础单位残差 0。 原表百万美元列示精度，检验可直接复算桥；阈值以美元计。</w:t>
-      </w:r>
-    </w:p>
-    <w:p>
-      <w:r>
-        <w:t>2024 持续加终止净利润 [R_net_2024]：within_input_tolerance；基础单位残差 0。 原表百万美元列示精度，检验可直接复算桥；阈值以美元计。</w:t>
-      </w:r>
-    </w:p>
-    <w:p>
-      <w:r>
-        <w:t>2024 综合收益桥 [R_comp_2024]：within_input_tolerance；基础单位残差 0。 原表百万美元列示精度，检验可直接复算桥；阈值以美元计。</w:t>
-      </w:r>
-    </w:p>
-    <w:p>
-      <w:r>
-        <w:t>2024 投资现金流组成 [R_cfi_2024]：within_input_tolerance；基础单位残差 0。 原表百万美元列示精度，检验可直接复算桥；阈值以美元计。</w:t>
-      </w:r>
-    </w:p>
-    <w:p>
-      <w:r>
-        <w:t>2024 融资现金流组成 [R_cff_2024]：within_input_tolerance；基础单位残差 0。 原表百万美元列示精度，检验可直接复算桥；阈值以美元计。</w:t>
-      </w:r>
-    </w:p>
-    <w:p>
-      <w:r>
-        <w:t>2024 三类现金流合计 [R_cashdelta_2024]：within_input_tolerance；基础单位残差 0。 原表百万美元列示精度，检验可直接复算桥；阈值以美元计。</w:t>
-      </w:r>
-    </w:p>
-    <w:p>
-      <w:r>
-        <w:t>2024 终止资产分项 [R_discassets_2024]：within_input_tolerance；基础单位残差 0。 原表百万美元列示精度，检验可直接复算桥；阈值以美元计。</w:t>
-      </w:r>
-    </w:p>
-    <w:p>
-      <w:r>
-        <w:t>2024 终止负债分项 [R_discliab_2024]：within_input_tolerance；基础单位残差 0。 原表百万美元列示精度，检验可直接复算桥；阈值以美元计。</w:t>
-      </w:r>
-    </w:p>
-    <w:p>
-      <w:r>
-        <w:t>2024 终止税前利润桥 [R_discpbt_2024]：within_input_tolerance；基础单位残差 0。 原表百万美元列示精度，检验可直接复算桥；阈值以美元计。</w:t>
-      </w:r>
-    </w:p>
-    <w:p>
-      <w:r>
-        <w:t>2024 终止处置前净利润桥 [R_discpre_2024]：within_input_tolerance；基础单位残差 0。 原表百万美元列示精度，检验可直接复算桥；阈值以美元计。</w:t>
-      </w:r>
-    </w:p>
-    <w:p>
-      <w:r>
-        <w:t>2024 持续税额调节 [R_tax_2024]：within_input_tolerance；基础单位残差 0。 原表百万美元列示精度，检验可直接复算桥；阈值以美元计。</w:t>
-      </w:r>
-    </w:p>
-    <w:p>
-      <w:r>
-        <w:t>2024 持续现金分层 [R_contcash_2024]：within_input_tolerance；基础单位残差 0。 原表百万美元列示精度，检验可直接复算桥；阈值以美元计。</w:t>
-      </w:r>
-    </w:p>
-    <w:p>
-      <w:r>
-        <w:t>2024 终止现金分层 [R_disccash_2024]：within_input_tolerance；基础单位残差 0。 原表百万美元列示精度，检验可直接复算桥；阈值以美元计。</w:t>
-      </w:r>
-    </w:p>
-    <w:p>
-      <w:r>
-        <w:t>2024 全部现金分层 [R_cashall_2024]：within_input_tolerance；基础单位残差 0。 原表百万美元列示精度，检验可直接复算桥；阈值以美元计。</w:t>
-      </w:r>
-    </w:p>
-    <w:p>
-      <w:r>
-        <w:t>2024 持续营业利润 [R_op_2024]：within_input_tolerance；基础单位残差 0。 原表百万美元列示精度，检验可直接复算桥；阈值以美元计。</w:t>
-      </w:r>
-    </w:p>
-    <w:p>
-      <w:r>
-        <w:t>2024 终止净损益 [R_discni_2024]：within_input_tolerance；基础单位残差 0。 原表百万美元列示精度，检验可直接复算桥；阈值以美元计。</w:t>
-      </w:r>
-    </w:p>
-    <w:p>
-      <w:r>
-        <w:t>2024 CFO 全桥 [R_cfo_2024]：within_input_tolerance；基础单位残差 0。 原表百万美元列示精度，检验可直接复算桥；阈值以美元计。</w:t>
-      </w:r>
-    </w:p>
-    <w:p>
-      <w:r>
-        <w:t>2024 现金滚动 [R_cashroll_2024]：within_input_tolerance；基础单位残差 0。 原表百万美元列示精度，检验可直接复算桥；阈值以美元计。</w:t>
-      </w:r>
-    </w:p>
-    <w:p>
-      <w:r>
-        <w:t>2024 权益滚动 [R_eqroll_2024]：within_input_tolerance；基础单位残差 0。 原表百万美元列示精度，检验可直接复算桥；阈值以美元计。</w:t>
-      </w:r>
-    </w:p>
-    <w:p>
-      <w:r>
-        <w:t>2025 准备与已发生费用至处置损失 [R_sale2025]：within_input_tolerance；基础单位残差 0。 原表百万美元列示精度，检验可直接复算桥；阈值以美元计。</w:t>
-      </w:r>
-    </w:p>
-    <w:p>
-      <w:r>
-        <w:t>合并商誉减值至期末余额 [R_gw2024]：within_input_tolerance；基础单位残差 0。 原表百万美元列示精度，检验可直接复算桥；阈值以美元计。</w:t>
-      </w:r>
-    </w:p>
-    <w:p>
-      <w:r>
-        <w:t>2024 原报与重列收入版本桥 [R_original_revenue]：unexplained_difference；基础单位残差 ‑2000000。 原报及重列皆原件实际读；2 百万美元差异未披露完整重列明细，零阈值保留差异，不作错报结论。</w:t>
-      </w:r>
-    </w:p>
-    <w:p>
-      <w:r>
-        <w:t>2024 原报至重列 pbt [R_recast_pbt]：within_input_tolerance；基础单位残差 0。 原表百万美元列示精度，检验可直接复算桥；阈值以美元计。</w:t>
-      </w:r>
-    </w:p>
-    <w:p>
-      <w:r>
-        <w:t>2024 原报至重列 tax [R_recast_tax]：within_input_tolerance；基础单位残差 0。 原表百万美元列示精度，检验可直接复算桥；阈值以美元计。</w:t>
-      </w:r>
-    </w:p>
-    <w:p>
-      <w:r>
-        <w:t>2024 原报至重列 ni [R_recast_ni]：within_input_tolerance；基础单位残差 0。 原表百万美元列示精度，检验可直接复算桥；阈值以美元计。</w:t>
-      </w:r>
-    </w:p>
-    <w:p>
-      <w:r>
-        <w:t>债务附注至资产负债表 [R_debt2025]：within_input_tolerance；基础单位残差 0。 原表百万美元列示精度，检验可直接复算桥；阈值以美元计。</w:t>
-      </w:r>
-    </w:p>
-    <w:p>
-      <w:r>
-        <w:t>债务分类桥 [R_debtsec2025]：within_input_tolerance；基础单位残差 0。 原表百万美元列示精度，检验可直接复算桥；阈值以美元计。</w:t>
-      </w:r>
-    </w:p>
-    <w:p>
-      <w:r>
-        <w:t>准备跨年滚动 [R_qallow]：within_input_tolerance；基础单位残差 0。 原表百万美元列示精度，检验可直接复算桥；阈值以美元计。</w:t>
-      </w:r>
-    </w:p>
-    <w:p>
-      <w:r>
-        <w:t>Q1 终止税前利润 [R_qpbt]：within_input_tolerance；基础单位残差 0。 原表百万美元列示精度，检验可直接复算桥；阈值以美元计。</w:t>
-      </w:r>
-    </w:p>
-    <w:p>
-      <w:r>
-        <w:t>Q1 终止处置前税后利润 [R_qdiscpre]：within_input_tolerance；基础单位残差 0。 原表百万美元列示精度，检验可直接复算桥；阈值以美元计。</w:t>
-      </w:r>
-    </w:p>
-    <w:p>
-      <w:r>
-        <w:t>Q1 现金分层 [R_qcash]：within_input_tolerance；基础单位残差 0。 原表百万美元列示精度，检验可直接复算桥；阈值以美元计。</w:t>
-      </w:r>
-    </w:p>
-    <w:p>
-      <w:r>
-        <w:t>Q1 债务桥 [R_qdebt]：within_input_tolerance；基础单位残差 0。 原表百万美元列示精度，检验可直接复算桥；阈值以美元计。</w:t>
-      </w:r>
-    </w:p>
-    <w:p>
-      <w:r>
-        <w:t>2025 Q1 原报准备与 SEC 回复 [R_priorallow_original]：within_input_tolerance；基础单位残差 0。 原表百万美元列示精度，检验可直接复算桥；阈值以美元计。</w:t>
-      </w:r>
-    </w:p>
-    <w:p>
-      <w:r>
-        <w:t>2026 Q1 对上年准备回述与原报桥 [R_priorallow_recalled]：unexplained_difference；基础单位残差 11000000。 同日同项跨版本比较；差额 11 百万美元保留，未知是否笔误、口径变化或其他更正。</w:t>
-      </w:r>
-    </w:p>
-    <w:p>
-      <w:r>
-        <w:t>利润变化分解 [R_nimove]：within_input_tolerance；基础单位残差 0。 原表百万美元列示精度，检验可直接复算桥；阈值以美元计。</w:t>
-      </w:r>
-    </w:p>
-    <w:p>
-      <w:r>
-        <w:t>公开备考价格—费用—偿债—剩余现金 [R_pf_cashadd]：within_input_tolerance；基础单位残差 0。 仅复算官方公开表所列百万美元精度；零阈值不代表审计门槛，残差单位美元。</w:t>
-      </w:r>
-    </w:p>
-    <w:p>
-      <w:r>
-        <w:t>公开备考现金基数加交易调整 [R_pf_cash]：within_input_tolerance；基础单位残差 0。 仅复算官方公开表所列百万美元精度；零阈值不代表审计门槛，残差单位美元。</w:t>
-      </w:r>
-    </w:p>
-    <w:p>
-      <w:r>
-        <w:t>公开备考资产调整 [R_pf_assetdelta]：within_input_tolerance；基础单位残差 0。 仅复算官方公开表所列百万美元精度；零阈值不代表审计门槛，残差单位美元。</w:t>
-      </w:r>
-    </w:p>
-    <w:p>
-      <w:r>
-        <w:t>公开备考负债调整 [R_pf_liabdelta]：within_input_tolerance；基础单位残差 0。 仅复算官方公开表所列百万美元精度；零阈值不代表审计门槛，残差单位美元。</w:t>
-      </w:r>
-    </w:p>
-    <w:p>
-      <w:r>
-        <w:t>公开备考资产/负债调整接权益 [R_pf_equitydelta]：within_input_tolerance；基础单位残差 0。 仅复算官方公开表所列百万美元精度；零阈值不代表审计门槛，残差单位美元。</w:t>
-      </w:r>
-    </w:p>
-    <w:p>
-      <w:r>
-        <w:t>公开备考历史权益加综合调整 [R_pf_equity]：within_input_tolerance；基础单位残差 0。 仅复算官方公开表所列百万美元精度；零阈值不代表审计门槛，残差单位美元。</w:t>
-      </w:r>
-    </w:p>
-    <w:p>
-      <w:r>
-        <w:t>公开备考利息行 [R_pf_interest]：within_input_tolerance；基础单位残差 0。 仅复算官方公开表所列百万美元精度；零阈值不代表审计门槛，残差单位美元。</w:t>
-      </w:r>
-    </w:p>
-    <w:p>
-      <w:r>
-        <w:t>公开备考持续经营利润 [R_pf_contni]：within_input_tolerance；基础单位残差 0。 仅复算官方公开表所列百万美元精度；零阈值不代表审计门槛，残差单位美元。</w:t>
-      </w:r>
-    </w:p>
-    <w:p>
-      <w:r>
-        <w:t>Fiber报告单元商誉滚动 [R_fibergw]：within_input_tolerance；基础单位残差 0。 仅复算官方公开表所列百万美元精度；零阈值不代表审计门槛，残差单位美元。</w:t>
+        <w:t>S&amp;P财务调整及分析估计</w:t>
+      </w:r>
+    </w:p>
+    <w:tbl>
+      <w:tblPr>
+        <w:tblStyle w:val="TableGrid"/>
+        <w:tblW w:type="auto" w:w="0"/>
+        <w:tblLayout w:type="fixed"/>
+        <w:tblLook w:firstColumn="1" w:firstRow="1" w:lastColumn="0" w:lastRow="0" w:noHBand="0" w:noVBand="1" w:val="04A0"/>
+        <w:tblBorders>
+          <w:top w:val="single" w:sz="4" w:color="D9D9D9"/>
+          <w:left w:val="single" w:sz="4" w:color="D9D9D9"/>
+          <w:bottom w:val="single" w:sz="4" w:color="D9D9D9"/>
+          <w:right w:val="single" w:sz="4" w:color="D9D9D9"/>
+          <w:insideH w:val="single" w:sz="4" w:color="D9D9D9"/>
+          <w:insideV w:val="single" w:sz="4" w:color="D9D9D9"/>
+        </w:tblBorders>
+      </w:tblPr>
+      <w:tblGrid>
+        <w:gridCol w:w="3411"/>
+        <w:gridCol w:w="4386"/>
+        <w:gridCol w:w="1949"/>
+      </w:tblGrid>
+      <w:tr>
+        <w:trPr>
+          <w:tblHeader/>
+          <w:cantSplit/>
+        </w:trPr>
+        <w:tc>
+          <w:tcPr>
+            <w:tcW w:type="dxa" w:w="3411"/>
+            <w:shd w:fill="E6EEF0"/>
+          </w:tcPr>
+          <w:p>
+            <w:pPr>
+              <w:keepNext/>
+            </w:pPr>
+            <w:r>
+              <w:t>项目及记录</w:t>
+            </w:r>
+          </w:p>
+        </w:tc>
+        <w:tc>
+          <w:tcPr>
+            <w:tcW w:type="dxa" w:w="4386"/>
+            <w:shd w:fill="E6EEF0"/>
+          </w:tcPr>
+          <w:p>
+            <w:pPr>
+              <w:keepNext/>
+            </w:pPr>
+            <w:r>
+              <w:t>期间及数值</w:t>
+            </w:r>
+          </w:p>
+        </w:tc>
+        <w:tc>
+          <w:tcPr>
+            <w:tcW w:type="dxa" w:w="1949"/>
+            <w:shd w:fill="E6EEF0"/>
+          </w:tcPr>
+          <w:p>
+            <w:pPr>
+              <w:keepNext/>
+            </w:pPr>
+            <w:r>
+              <w:t>证据</w:t>
+            </w:r>
+          </w:p>
+        </w:tc>
+      </w:tr>
+      <w:tr>
+        <w:trPr>
+          <w:cantSplit/>
+        </w:trPr>
+        <w:tc>
+          <w:tcPr>
+            <w:tcW w:type="dxa" w:w="3411"/>
+          </w:tcPr>
+          <w:p>
+            <w:r>
+              <w:t>经营租赁利息代理 [sp_lease_interest]</w:t>
+            </w:r>
+          </w:p>
+        </w:tc>
+        <w:tc>
+          <w:tcPr>
+            <w:tcW w:type="dxa" w:w="4386"/>
+          </w:tcPr>
+          <w:p>
+            <w:r>
+              <w:t>2025-12-31</w:t>
+              <w:br/>
+              <w:t>274.43 百万USD</w:t>
+            </w:r>
+          </w:p>
+        </w:tc>
+        <w:tc>
+          <w:tcPr>
+            <w:tcW w:type="dxa" w:w="1949"/>
+          </w:tcPr>
+          <w:p>
+            <w:r>
+              <w:t>专门结果 Q_sp_crown（输入与证据见该节）</w:t>
+            </w:r>
+          </w:p>
+        </w:tc>
+      </w:tr>
+      <w:tr>
+        <w:trPr>
+          <w:cantSplit/>
+        </w:trPr>
+        <w:tc>
+          <w:tcPr>
+            <w:tcW w:type="dxa" w:w="3411"/>
+          </w:tcPr>
+          <w:p>
+            <w:r>
+              <w:t>S&amp;P口径EBITDA分析估计 [sp_ebitda]</w:t>
+            </w:r>
+          </w:p>
+        </w:tc>
+        <w:tc>
+          <w:tcPr>
+            <w:tcW w:type="dxa" w:w="4386"/>
+          </w:tcPr>
+          <w:p>
+            <w:r>
+              <w:t>2025-12-31</w:t>
+              <w:br/>
+              <w:t>3,448.00 百万USD</w:t>
+            </w:r>
+          </w:p>
+        </w:tc>
+        <w:tc>
+          <w:tcPr>
+            <w:tcW w:type="dxa" w:w="1949"/>
+          </w:tcPr>
+          <w:p>
+            <w:r>
+              <w:t>专门结果 Q_sp_crown（输入与证据见该节）</w:t>
+            </w:r>
+          </w:p>
+        </w:tc>
+      </w:tr>
+      <w:tr>
+        <w:trPr>
+          <w:cantSplit/>
+        </w:trPr>
+        <w:tc>
+          <w:tcPr>
+            <w:tcW w:type="dxa" w:w="3411"/>
+          </w:tcPr>
+          <w:p>
+            <w:r>
+              <w:t>FFO分析估计 [sp_ffo]</w:t>
+            </w:r>
+          </w:p>
+        </w:tc>
+        <w:tc>
+          <w:tcPr>
+            <w:tcW w:type="dxa" w:w="4386"/>
+          </w:tcPr>
+          <w:p>
+            <w:r>
+              <w:t>2025-12-31</w:t>
+              <w:br/>
+              <w:t>2,178.57 百万USD</w:t>
+            </w:r>
+          </w:p>
+        </w:tc>
+        <w:tc>
+          <w:tcPr>
+            <w:tcW w:type="dxa" w:w="1949"/>
+          </w:tcPr>
+          <w:p>
+            <w:r>
+              <w:t>专门结果 Q_sp_crown（输入与证据见该节）</w:t>
+            </w:r>
+          </w:p>
+        </w:tc>
+      </w:tr>
+      <w:tr>
+        <w:trPr>
+          <w:cantSplit/>
+        </w:trPr>
+        <w:tc>
+          <w:tcPr>
+            <w:tcW w:type="dxa" w:w="3411"/>
+          </w:tcPr>
+          <w:p>
+            <w:r>
+              <w:t>CFO分析估计 [sp_cfo]</w:t>
+            </w:r>
+          </w:p>
+        </w:tc>
+        <w:tc>
+          <w:tcPr>
+            <w:tcW w:type="dxa" w:w="4386"/>
+          </w:tcPr>
+          <w:p>
+            <w:r>
+              <w:t>2025-12-31</w:t>
+              <w:br/>
+              <w:t>2,181.57 百万USD</w:t>
+            </w:r>
+          </w:p>
+        </w:tc>
+        <w:tc>
+          <w:tcPr>
+            <w:tcW w:type="dxa" w:w="1949"/>
+          </w:tcPr>
+          <w:p>
+            <w:r>
+              <w:t>专门结果 Q_sp_crown（输入与证据见该节）</w:t>
+            </w:r>
+          </w:p>
+        </w:tc>
+      </w:tr>
+      <w:tr>
+        <w:trPr>
+          <w:cantSplit/>
+        </w:trPr>
+        <w:tc>
+          <w:tcPr>
+            <w:tcW w:type="dxa" w:w="3411"/>
+          </w:tcPr>
+          <w:p>
+            <w:r>
+              <w:t>FOCF分析估计（尚非付完全部租赁本金的现金） [sp_focf]</w:t>
+            </w:r>
+          </w:p>
+        </w:tc>
+        <w:tc>
+          <w:tcPr>
+            <w:tcW w:type="dxa" w:w="4386"/>
+          </w:tcPr>
+          <w:p>
+            <w:r>
+              <w:t>2025-12-31</w:t>
+              <w:br/>
+              <w:t>2,014.57 百万USD</w:t>
+            </w:r>
+          </w:p>
+        </w:tc>
+        <w:tc>
+          <w:tcPr>
+            <w:tcW w:type="dxa" w:w="1949"/>
+          </w:tcPr>
+          <w:p>
+            <w:r>
+              <w:t>专门结果 Q_sp_crown（输入与证据见该节）</w:t>
+            </w:r>
+          </w:p>
+        </w:tc>
+      </w:tr>
+      <w:tr>
+        <w:trPr>
+          <w:cantSplit/>
+        </w:trPr>
+        <w:tc>
+          <w:tcPr>
+            <w:tcW w:type="dxa" w:w="3411"/>
+          </w:tcPr>
+          <w:p>
+            <w:r>
+              <w:t>债务分析估计（ARO尚未抵减） [sp_gross_debt]</w:t>
+            </w:r>
+          </w:p>
+        </w:tc>
+        <w:tc>
+          <w:tcPr>
+            <w:tcW w:type="dxa" w:w="4386"/>
+          </w:tcPr>
+          <w:p>
+            <w:r>
+              <w:t>2025-12-31</w:t>
+              <w:br/>
+              <w:t>29,888.00 百万USD</w:t>
+            </w:r>
+          </w:p>
+        </w:tc>
+        <w:tc>
+          <w:tcPr>
+            <w:tcW w:type="dxa" w:w="1949"/>
+          </w:tcPr>
+          <w:p>
+            <w:r>
+              <w:t>专门结果 Q_sp_crown（输入与证据见该节）</w:t>
+            </w:r>
+          </w:p>
+        </w:tc>
+      </w:tr>
+      <w:tr>
+        <w:trPr>
+          <w:cantSplit/>
+        </w:trPr>
+        <w:tc>
+          <w:tcPr>
+            <w:tcW w:type="dxa" w:w="3411"/>
+          </w:tcPr>
+          <w:p>
+            <w:r>
+              <w:t>2025历史条件债务/EBITDA [sp_leverage]</w:t>
+            </w:r>
+          </w:p>
+        </w:tc>
+        <w:tc>
+          <w:tcPr>
+            <w:tcW w:type="dxa" w:w="4386"/>
+          </w:tcPr>
+          <w:p>
+            <w:r>
+              <w:t>2025-12-31</w:t>
+              <w:br/>
+              <w:t>8.64 倍</w:t>
+            </w:r>
+          </w:p>
+        </w:tc>
+        <w:tc>
+          <w:tcPr>
+            <w:tcW w:type="dxa" w:w="1949"/>
+          </w:tcPr>
+          <w:p>
+            <w:r>
+              <w:t>专门结果 Q_sp_crown（输入与证据见该节）</w:t>
+            </w:r>
+          </w:p>
+        </w:tc>
+      </w:tr>
+    </w:tbl>
+    <w:p/>
+    <w:p>
+      <w:pPr>
+        <w:pStyle w:val="Heading2"/>
+      </w:pPr>
+      <w:r>
+        <w:t>租赁调整应同时改变债务、盈利及现金分类 [F13; conditional]</w:t>
+      </w:r>
+    </w:p>
+    <w:p>
+      <w:r>
+        <w:t>期末经营租赁负债5,229.00 百万USD，真实期初期末均值5,277.50 百万USD。按披露贴现率计算利息代理274.43 百万USD及CFO加回代理324.57 百万USD；实际经营租赁付现519.00 百万USD另列。该分类不增加可支用现金。</w:t>
+      </w:r>
+    </w:p>
+    <w:p>
+      <w:r>
+        <w:t>ROU成本599.00 百万USD与可变费用147.00 百万USD分开；可变费用没有进入对应租赁负债，继续留经营成本。融资租赁折旧已在DDA内、融资租赁负债已在金融债内；预付租赁PPA和直线租赁成本不能再叠加到ROU成本。Crown为塔资产提供方，不直接套移动运营商MSA付塔费分支。</w:t>
+      </w:r>
+    </w:p>
+    <w:p>
+      <w:r>
+        <w:t>证据：E_SP_RATIOS, E_SP_SCOPE, E_SP_LEASE, sp_lease_interest, sp_lease_principal_proxy</w:t>
+      </w:r>
+    </w:p>
+    <w:p>
+      <w:r>
+        <w:t>反证：尚无足以排除其他解释的额外证据</w:t>
+      </w:r>
+    </w:p>
+    <w:p>
+      <w:r>
+        <w:t>其他解释：期末披露贴现率是方法要求的年度利息代理；实际租赁现金仍可能因预付、确认节奏和新增合同不同于该代理。</w:t>
+      </w:r>
+    </w:p>
+    <w:p>
+      <w:r>
+        <w:t>判断改变条件：未来续租、可变租金、地块迁移或合同范围改变时重做债务与现金路径；不把租赁CFO加回当新增偿债来源。</w:t>
+      </w:r>
+    </w:p>
+    <w:p>
+      <w:pPr>
+        <w:pStyle w:val="Heading2"/>
+      </w:pPr>
+      <w:r>
+        <w:t>从原报至EBITDA、FFO与FOCF的估计桥 [F14; conditional]</w:t>
+      </w:r>
+    </w:p>
+    <w:p>
+      <w:r>
+        <w:t>SEC原申报确认现金付息965.00 百万USD排除资本化利息。以资本化现金付息15.00 百万USD估计，EBITDA为3,448.00 百万USD、FFO为2,178.57 百万USD、CFO为2,181.57 百万USD、FOCF为2,014.57 百万USD。这些为方法分析估计，不是机构已发表指标；FOCF尚非支付全部租赁本金后的自由现金。</w:t>
+      </w:r>
+    </w:p>
+    <w:p>
+      <w:r>
+        <w:t>现金税采用15.00 百万USD而非费用16；ARO非现金增值只接应计利息，不再当现金。股份支付73.00 百万USD中RSU61.00 百万USD已直接证实，差额12.00 百万USD另作敏感性：只加回RSU时EBITDA3,436.00 百万USD、FFO2,166.57 百万USD。净减记行与PP&amp;E核销差1.00 百万USD未解释，采用总额敏感性EBITDA3,449.00 百万USD。现有业务没有外售软件触发，适用内部使用软件不反转分支；不把未披露IT投入全额费用化。资本化现金估计每增加一单位，FFO/CFO各下降一单位，capex也下降一单位，FOCF不变。</w:t>
+      </w:r>
+    </w:p>
+    <w:p>
+      <w:r>
+        <w:t>证据：E_SP_RATIOS, E_SP_CASH, E_SP_SBC, E_SP_ARO, E_SP_XBRL, sp_ebitda, sp_ffo, sp_focf</w:t>
+      </w:r>
+    </w:p>
+    <w:p>
+      <w:r>
+        <w:t>反证：C_sp_sbc_residual, C_sp_writeoff_difference</w:t>
+      </w:r>
+    </w:p>
+    <w:p>
+      <w:r>
+        <w:t>其他解释：非RSU差额可能仍符合权益结算条件，不能把仅加回RSU的敏感性当已证实主值；净减记与PP&amp;E总额差异也不能未经证据命名为转回。</w:t>
+      </w:r>
+    </w:p>
+    <w:p>
+      <w:r>
+        <w:t>判断改变条件：取得资本化现金结算、股份支付差额分类或减记差额后更新相关项及聚合影响；接近财务分档临界值时提高精确取证程度，不暂停已可完成的分析。</w:t>
+      </w:r>
+    </w:p>
+    <w:p>
+      <w:pPr>
+        <w:pStyle w:val="Heading2"/>
+      </w:pPr>
+      <w:r>
+        <w:t>历史高杠杆与售后去杠杆须按时间连接 [F15; conditional]</w:t>
+      </w:r>
+    </w:p>
+    <w:p>
+      <w:r>
+        <w:t>将经营租赁及尚未抵减ARO接入后，2025债务估计29,888.00 百万USD。仅在普通现金符合可动用条件时净债为29,789.00 百万USD，对应历史债务/EBITDA8.64 倍、FFO/债务7.31%。这是2025保留业务与债务的历史压力，不是出售后杠杆或评级等级。</w:t>
+      </w:r>
+    </w:p>
+    <w:p>
+      <w:r>
+        <w:t>ARO滚动可勾稽，但具体税益、专用基金及残值需继续核；不能对REIT机械套21%或认定税益必为零。受限现金须按用途判断，不能全扣或永久全排除；最低运营现金需求属于实际预算，不能擅加为S&amp;P抵债的普遍条件。2025备考按2,002.00 百万USD偿债、利息改善85.00 百万USD；五月实际已偿约3,300.00 百万USD，后续偿债与回购仍为计划。出售现金释放与保留租赁义务、资本分配需同时接入预测，不能以出售总价直接冲历史债务。</w:t>
+      </w:r>
+    </w:p>
+    <w:p>
+      <w:r>
+        <w:t>证据：E_SP_RATIOS, E_SP_ARO, E25CASH, EPROBASIS, EPROBS, EPROPL, EQ126SALE, sp_net_debt, sp_leverage</w:t>
+      </w:r>
+    </w:p>
+    <w:p>
+      <w:r>
+        <w:t>反证：missing_parent_cash</w:t>
+      </w:r>
+    </w:p>
+    <w:p>
+      <w:r>
+        <w:t>其他解释：已完成出售和偿债降低融资负担，但租赁义务仍保留，回购与资本投入会消耗释放现金；历史杠杆不能单独说明售后状态。</w:t>
+      </w:r>
+    </w:p>
+    <w:p>
+      <w:r>
+        <w:t>判断改变条件：取得截至六月的售后实际债务、可支用现金和完成回购记录后更新债务/现金桥，再用经营及续约预测判断财务档和流动性。</w:t>
       </w:r>
     </w:p>
     <w:p>
@@ -2648,50 +2696,263 @@
         <w:pStyle w:val="Heading1"/>
       </w:pPr>
       <w:r>
-        <w:t>已执行程序与待核工作</w:t>
-      </w:r>
-    </w:p>
+        <w:t>经营变化与信用方法形成</w:t>
+      </w:r>
+    </w:p>
+    <w:tbl>
+      <w:tblPr>
+        <w:tblStyle w:val="TableGrid"/>
+        <w:tblW w:type="auto" w:w="0"/>
+        <w:tblLayout w:type="fixed"/>
+        <w:tblLook w:firstColumn="1" w:firstRow="1" w:lastColumn="0" w:lastRow="0" w:noHBand="0" w:noVBand="1" w:val="04A0"/>
+        <w:tblBorders>
+          <w:top w:val="single" w:sz="4" w:color="D9D9D9"/>
+          <w:left w:val="single" w:sz="4" w:color="D9D9D9"/>
+          <w:bottom w:val="single" w:sz="4" w:color="D9D9D9"/>
+          <w:right w:val="single" w:sz="4" w:color="D9D9D9"/>
+          <w:insideH w:val="single" w:sz="4" w:color="D9D9D9"/>
+          <w:insideV w:val="single" w:sz="4" w:color="D9D9D9"/>
+        </w:tblBorders>
+      </w:tblPr>
+      <w:tblGrid>
+        <w:gridCol w:w="3411"/>
+        <w:gridCol w:w="4386"/>
+        <w:gridCol w:w="1949"/>
+      </w:tblGrid>
+      <w:tr>
+        <w:trPr>
+          <w:tblHeader/>
+          <w:cantSplit/>
+        </w:trPr>
+        <w:tc>
+          <w:tcPr>
+            <w:tcW w:type="dxa" w:w="3411"/>
+            <w:shd w:fill="E6EEF0"/>
+          </w:tcPr>
+          <w:p>
+            <w:pPr>
+              <w:keepNext/>
+            </w:pPr>
+            <w:r>
+              <w:t>项目及记录</w:t>
+            </w:r>
+          </w:p>
+        </w:tc>
+        <w:tc>
+          <w:tcPr>
+            <w:tcW w:type="dxa" w:w="4386"/>
+            <w:shd w:fill="E6EEF0"/>
+          </w:tcPr>
+          <w:p>
+            <w:pPr>
+              <w:keepNext/>
+            </w:pPr>
+            <w:r>
+              <w:t>期间及数值</w:t>
+            </w:r>
+          </w:p>
+        </w:tc>
+        <w:tc>
+          <w:tcPr>
+            <w:tcW w:type="dxa" w:w="1949"/>
+            <w:shd w:fill="E6EEF0"/>
+          </w:tcPr>
+          <w:p>
+            <w:pPr>
+              <w:keepNext/>
+            </w:pPr>
+            <w:r>
+              <w:t>证据</w:t>
+            </w:r>
+          </w:p>
+        </w:tc>
+      </w:tr>
+      <w:tr>
+        <w:trPr>
+          <w:cantSplit/>
+        </w:trPr>
+        <w:tc>
+          <w:tcPr>
+            <w:tcW w:type="dxa" w:w="3411"/>
+          </w:tcPr>
+          <w:p>
+            <w:r>
+              <w:t>持续经营Q1 CFO 2026 [C_sp_q1_cfo_2026]</w:t>
+            </w:r>
+          </w:p>
+        </w:tc>
+        <w:tc>
+          <w:tcPr>
+            <w:tcW w:type="dxa" w:w="4386"/>
+          </w:tcPr>
+          <w:p>
+            <w:r>
+              <w:t>2026-03-31</w:t>
+              <w:br/>
+              <w:t>296.00 百万USD</w:t>
+            </w:r>
+          </w:p>
+        </w:tc>
+        <w:tc>
+          <w:tcPr>
+            <w:tcW w:type="dxa" w:w="1949"/>
+          </w:tcPr>
+          <w:p>
+            <w:r>
+              <w:t>E_SP_Q1CFO</w:t>
+            </w:r>
+          </w:p>
+        </w:tc>
+      </w:tr>
+      <w:tr>
+        <w:trPr>
+          <w:cantSplit/>
+        </w:trPr>
+        <w:tc>
+          <w:tcPr>
+            <w:tcW w:type="dxa" w:w="3411"/>
+          </w:tcPr>
+          <w:p>
+            <w:r>
+              <w:t>持续经营Q1 CFO同比 [C_sp_q1_cfo_change]</w:t>
+            </w:r>
+          </w:p>
+        </w:tc>
+        <w:tc>
+          <w:tcPr>
+            <w:tcW w:type="dxa" w:w="4386"/>
+          </w:tcPr>
+          <w:p>
+            <w:r>
+              <w:t>2026-03-31</w:t>
+              <w:br/>
+              <w:t>‑20.22%</w:t>
+            </w:r>
+          </w:p>
+        </w:tc>
+        <w:tc>
+          <w:tcPr>
+            <w:tcW w:type="dxa" w:w="1949"/>
+          </w:tcPr>
+          <w:p>
+            <w:r>
+              <w:t>E_SP_Q1CFO</w:t>
+            </w:r>
+          </w:p>
+        </w:tc>
+      </w:tr>
+      <w:tr>
+        <w:trPr>
+          <w:cantSplit/>
+        </w:trPr>
+        <w:tc>
+          <w:tcPr>
+            <w:tcW w:type="dxa" w:w="3411"/>
+          </w:tcPr>
+          <w:p>
+            <w:r>
+              <w:t>Q1站点billings变动 [C_sp_bill_change]</w:t>
+            </w:r>
+          </w:p>
+        </w:tc>
+        <w:tc>
+          <w:tcPr>
+            <w:tcW w:type="dxa" w:w="4386"/>
+          </w:tcPr>
+          <w:p>
+            <w:r>
+              <w:t>2026-03-31</w:t>
+              <w:br/>
+              <w:t>‑24.00 百万USD</w:t>
+            </w:r>
+          </w:p>
+        </w:tc>
+        <w:tc>
+          <w:tcPr>
+            <w:tcW w:type="dxa" w:w="1949"/>
+          </w:tcPr>
+          <w:p>
+            <w:r>
+              <w:t>E_SP_Q1BILL</w:t>
+            </w:r>
+          </w:p>
+        </w:tc>
+      </w:tr>
+      <w:tr>
+        <w:trPr>
+          <w:cantSplit/>
+        </w:trPr>
+        <w:tc>
+          <w:tcPr>
+            <w:tcW w:type="dxa" w:w="3411"/>
+          </w:tcPr>
+          <w:p>
+            <w:r>
+              <w:t>2028续约组AT&amp;T暴露占比 [C_sp_renew_share]</w:t>
+            </w:r>
+          </w:p>
+        </w:tc>
+        <w:tc>
+          <w:tcPr>
+            <w:tcW w:type="dxa" w:w="4386"/>
+          </w:tcPr>
+          <w:p>
+            <w:r>
+              <w:t>2025-12-31</w:t>
+              <w:br/>
+              <w:t>90.01%</w:t>
+            </w:r>
+          </w:p>
+        </w:tc>
+        <w:tc>
+          <w:tcPr>
+            <w:tcW w:type="dxa" w:w="1949"/>
+          </w:tcPr>
+          <w:p>
+            <w:r>
+              <w:t>E_SP_RENEW</w:t>
+            </w:r>
+          </w:p>
+        </w:tc>
+      </w:tr>
+    </w:tbl>
+    <w:p/>
     <w:p>
       <w:pPr>
         <w:pStyle w:val="Heading2"/>
       </w:pPr>
       <w:r>
-        <w:t>P01 核实减值先后及测试单元</w:t>
-      </w:r>
-    </w:p>
-    <w:p>
-      <w:r>
-        <w:t>状态 performed；认定 披露一致性、计算准确性、期间及范围；总体 上述来源已明确定位的公开页面与表格，非企业交易总体；选取 围绕交易、四表及资金债务的针对性选取；不是统计审计抽样。</w:t>
-      </w:r>
-    </w:p>
-    <w:p>
-      <w:r>
-        <w:t>读 2024 年报政策、商誉滚动和资产核销段落</w:t>
-      </w:r>
-    </w:p>
-    <w:p>
-      <w:r>
-        <w:t>读 SEC 问询回复关于测试顺序、资产组、CBSA 及计量基础的说明</w:t>
-      </w:r>
-    </w:p>
-    <w:p>
-      <w:r>
-        <w:t>读 FASB ASU 2017-04 选定条款并视觉区分增删标记，不把 ASU 称权威 Codification</w:t>
-      </w:r>
-    </w:p>
-    <w:p>
-      <w:r>
-        <w:t>复算商誉期初减费用至期末</w:t>
-      </w:r>
-    </w:p>
-    <w:p>
-      <w:r>
-        <w:t>重新读note5/p75并核图像：Fiber4,958至0、Towers5,127不变；更正合并标签并复算分部桥</w:t>
-      </w:r>
-    </w:p>
-    <w:p>
-      <w:r>
-        <w:t>实际结果：公开披露顺序与算术支持；未取得模型，未重新执行估值。；证据 E24IMPAIR, E24WRITE, ESECSEQ, EFASB, C_gw2024, C_fibergw。</w:t>
+        <w:t>Q1实际现金与客户违约检验历史趋势 [F16; supported]</w:t>
+      </w:r>
+    </w:p>
+    <w:p>
+      <w:r>
+        <w:t>同口径持续经营Q1 CFO由371.00 百万USD降至296.00 百万USD，同比‑20.22%。剔DISH/Sprint后的billings增量30.00 百万USD，被DISH-49.00 百万USD及Sprint-5.00 百万USD抵销，净变动‑24.00 百万USD。现金降幅不能全归因DISH；需继续分解营运资本、支付节奏和重组。</w:t>
+      </w:r>
+    </w:p>
+    <w:p>
+      <w:r>
+        <w:t>公司Q1的2026重组计划费用14.00 百万USD、支付12.00 百万USD和余额2.00 百万USD；2023/2024计划另有本期支付4.00 百万USD、余额12.00 百万USD。经营性重组不能跟随公司非GAAP任意全部加回。DISH索赔不是现金，管理层应收可回收判断也不是确定回款。当前实际证据支持压力已经发生，同时说明剔除两个事件的业务仍有增长，不能只给单方向故事。</w:t>
+      </w:r>
+    </w:p>
+    <w:p>
+      <w:r>
+        <w:t>证据：E_SP_Q1CFO, E_SP_Q1BILL, EDISH, C_sp_q1_cfo_change, C_sp_bill_change</w:t>
+      </w:r>
+    </w:p>
+    <w:p>
+      <w:r>
+        <w:t>反证：尚无足以排除其他解释的额外证据</w:t>
+      </w:r>
+    </w:p>
+    <w:p>
+      <w:r>
+        <w:t>其他解释：应付结算、计息支付及重组付款可令季度CFO变化大于经常盈利变化；DISH实际损失不排除其他客户仍有新增租赁及合同提价。</w:t>
+      </w:r>
+    </w:p>
+    <w:p>
+      <w:r>
+        <w:t>判断改变条件：取得Q1现金变化逐项归因、DISH实收及后续续约后更新现金预测；对持续增长和特定客户损失分别建情景。</w:t>
       </w:r>
     </w:p>
     <w:p>
@@ -2699,37 +2960,1163 @@
         <w:pStyle w:val="Heading2"/>
       </w:pPr>
       <w:r>
-        <w:t>P02 验证持有待售损失组成</w:t>
-      </w:r>
-    </w:p>
-    <w:p>
-      <w:r>
-        <w:t>状态 performed；认定 披露一致性、计算准确性、期间及范围；总体 上述来源已明确定位的公开页面与表格，非企业交易总体；选取 围绕交易、四表及资金债务的针对性选取；不是统计审计抽样。</w:t>
-      </w:r>
-    </w:p>
-    <w:p>
-      <w:r>
-        <w:t>读年报 note 3 及脚注，逐页图像核对金额与列头</w:t>
-      </w:r>
-    </w:p>
-    <w:p>
-      <w:r>
-        <w:t>把准备与售出费用同表损失勾稽；分别保留税、现金及范围</w:t>
-      </w:r>
-    </w:p>
-    <w:p>
-      <w:r>
-        <w:t>实际补读最初签署协议§2.2–2.7及所用定义，区分公开机制、未公开附表和实际结算</w:t>
-      </w:r>
-    </w:p>
-    <w:p>
-      <w:r>
-        <w:t>读取五月公开备考，明确不能倒填2025年末89差额；检查已读官方索引的修订信息</w:t>
-      </w:r>
-    </w:p>
-    <w:p>
-      <w:r>
-        <w:t>实际结果：分类与2025损失桥保留；公开价格/结算机制及备考已取得，年末89差额、实际结算和未识别修订影响仍未解释。；证据 E25HFS, ESECSALE, C_sale2025, ESPAPRICE, ESPASETTLE, EPROBS, EQ126INDEX。</w:t>
+        <w:t>塔资产控制、续约集中与波动档形成 [F17; conditional]</w:t>
+      </w:r>
+    </w:p>
+    <w:p>
+      <w:r>
+        <w:t>自有土地覆盖30.26%的塔，贡献42.68%的末季年化毛现金利润。2028续约组年度化租金暴露中AT&amp;T占90.01%，该暴露不代表当年确定损失。长期租赁及续约经济性支持将medial列为待验证候选；若相应条件不满足则检验standard，不能预授low或直接输出等级。</w:t>
+      </w:r>
+    </w:p>
+    <w:p>
+      <w:r>
+        <w:t>租地35年含公司续约权、账内租赁15年、客户当前合同6年/AT&amp;T3年各有不同定义。土地控制和核心市场规模是正面证据，客户集中及DISH违约为反证。S&amp;P数字基础设施章低/中波动要求业务风险、竞争地位及至少90%/2/3可预测CFO等共同条件；收入占比不能替代CFO归属，客户短剩余期也不单独否定支持性框架路径。本案尚未独立完成CICRA、竞争地位、预测CFO及支持债项形成链，保留明确分支，不将保守标签视作已证实分类。</w:t>
+      </w:r>
+    </w:p>
+    <w:p>
+      <w:r>
+        <w:t>证据：E_SP_LAND, E_SP_RENEW, E_SP_SECTORS, E_SP_Q1BILL, C_sp_renew_share</w:t>
+      </w:r>
+    </w:p>
+    <w:p>
+      <w:r>
+        <w:t>反证：EDISH</w:t>
+      </w:r>
+    </w:p>
+    <w:p>
+      <w:r>
+        <w:t>其他解释：网络迁移成本、核心站点及可执行土地续约权可能缓释集中风险；DISH违约和AT&amp;T续约集中则要求验证客户质量和费率假设，不能由平均合同期直接定档。</w:t>
+      </w:r>
+    </w:p>
+    <w:p>
+      <w:r>
+        <w:t>判断改变条件：把实际土地续约权、客户续约费率/迁移经济性和违约压力接入预测，核准竞争地位及现金归属，再确定波动档和后续评级路径。</w:t>
+      </w:r>
+    </w:p>
+    <w:p>
+      <w:pPr>
+        <w:pStyle w:val="Heading1"/>
+      </w:pPr>
+      <w:r>
+        <w:t>勾稽结果</w:t>
+      </w:r>
+    </w:p>
+    <w:p>
+      <w:r>
+        <w:t>2025 流动资产分项合计 [R_ca_2025]：within_input_tolerance；基础单位残差 0。 原表百万美元列示精度，检验可直接复算桥；阈值以美元计。</w:t>
+      </w:r>
+    </w:p>
+    <w:p>
+      <w:r>
+        <w:t>2025 总资产分项合计 [R_assets_2025]：within_input_tolerance；基础单位残差 0。 原表百万美元列示精度，检验可直接复算桥；阈值以美元计。</w:t>
+      </w:r>
+    </w:p>
+    <w:p>
+      <w:r>
+        <w:t>2025 流动负债分项合计 [R_cl_2025]：within_input_tolerance；基础单位残差 0。 原表百万美元列示精度，检验可直接复算桥；阈值以美元计。</w:t>
+      </w:r>
+    </w:p>
+    <w:p>
+      <w:r>
+        <w:t>2025 总负债分项合计 [R_liab_2025]：within_input_tolerance；基础单位残差 0。 原表百万美元列示精度，检验可直接复算桥；阈值以美元计。</w:t>
+      </w:r>
+    </w:p>
+    <w:p>
+      <w:r>
+        <w:t>2025 权益组成 [R_eqparts_2025]：within_input_tolerance；基础单位残差 0。 原表百万美元列示精度，检验可直接复算桥；阈值以美元计。</w:t>
+      </w:r>
+    </w:p>
+    <w:p>
+      <w:r>
+        <w:t>2025 资产负债恒等式 [R_bs_2025]：within_input_tolerance；基础单位残差 0。 原表百万美元列示精度，检验可直接复算桥；阈值以美元计。</w:t>
+      </w:r>
+    </w:p>
+    <w:p>
+      <w:r>
+        <w:t>2025 持续收入组成 [R_rev_2025]：within_input_tolerance；基础单位残差 0。 原表百万美元列示精度，检验可直接复算桥；阈值以美元计。</w:t>
+      </w:r>
+    </w:p>
+    <w:p>
+      <w:r>
+        <w:t>2025 持续费用组成 [R_opex_2025]：within_input_tolerance；基础单位残差 0。 原表百万美元列示精度，检验可直接复算桥；阈值以美元计。</w:t>
+      </w:r>
+    </w:p>
+    <w:p>
+      <w:r>
+        <w:t>2025 持续税前利润桥 [R_pbt_2025]：within_input_tolerance；基础单位残差 0。 原表百万美元列示精度，检验可直接复算桥；阈值以美元计。</w:t>
+      </w:r>
+    </w:p>
+    <w:p>
+      <w:r>
+        <w:t>2025 持续净利润桥 [R_contni_2025]：within_input_tolerance；基础单位残差 0。 原表百万美元列示精度，检验可直接复算桥；阈值以美元计。</w:t>
+      </w:r>
+    </w:p>
+    <w:p>
+      <w:r>
+        <w:t>2025 持续加终止净利润 [R_net_2025]：within_input_tolerance；基础单位残差 0。 原表百万美元列示精度，检验可直接复算桥；阈值以美元计。</w:t>
+      </w:r>
+    </w:p>
+    <w:p>
+      <w:r>
+        <w:t>2025 综合收益桥 [R_comp_2025]：within_input_tolerance；基础单位残差 0。 原表百万美元列示精度，检验可直接复算桥；阈值以美元计。</w:t>
+      </w:r>
+    </w:p>
+    <w:p>
+      <w:r>
+        <w:t>2025 投资现金流组成 [R_cfi_2025]：within_input_tolerance；基础单位残差 0。 原表百万美元列示精度，检验可直接复算桥；阈值以美元计。</w:t>
+      </w:r>
+    </w:p>
+    <w:p>
+      <w:r>
+        <w:t>2025 融资现金流组成 [R_cff_2025]：within_input_tolerance；基础单位残差 0。 原表百万美元列示精度，检验可直接复算桥；阈值以美元计。</w:t>
+      </w:r>
+    </w:p>
+    <w:p>
+      <w:r>
+        <w:t>2025 三类现金流合计 [R_cashdelta_2025]：within_input_tolerance；基础单位残差 0。 原表百万美元列示精度，检验可直接复算桥；阈值以美元计。</w:t>
+      </w:r>
+    </w:p>
+    <w:p>
+      <w:r>
+        <w:t>2025 终止资产分项 [R_discassets_2025]：within_input_tolerance；基础单位残差 0。 原表百万美元列示精度，检验可直接复算桥；阈值以美元计。</w:t>
+      </w:r>
+    </w:p>
+    <w:p>
+      <w:r>
+        <w:t>2025 终止负债分项 [R_discliab_2025]：within_input_tolerance；基础单位残差 0。 原表百万美元列示精度，检验可直接复算桥；阈值以美元计。</w:t>
+      </w:r>
+    </w:p>
+    <w:p>
+      <w:r>
+        <w:t>2025 终止税前利润桥 [R_discpbt_2025]：within_input_tolerance；基础单位残差 0。 原表百万美元列示精度，检验可直接复算桥；阈值以美元计。</w:t>
+      </w:r>
+    </w:p>
+    <w:p>
+      <w:r>
+        <w:t>2025 终止处置前净利润桥 [R_discpre_2025]：within_input_tolerance；基础单位残差 0。 原表百万美元列示精度，检验可直接复算桥；阈值以美元计。</w:t>
+      </w:r>
+    </w:p>
+    <w:p>
+      <w:r>
+        <w:t>2025 持续税额调节 [R_tax_2025]：within_input_tolerance；基础单位残差 0。 原表百万美元列示精度，检验可直接复算桥；阈值以美元计。</w:t>
+      </w:r>
+    </w:p>
+    <w:p>
+      <w:r>
+        <w:t>2025 持续现金分层 [R_contcash_2025]：within_input_tolerance；基础单位残差 0。 原表百万美元列示精度，检验可直接复算桥；阈值以美元计。</w:t>
+      </w:r>
+    </w:p>
+    <w:p>
+      <w:r>
+        <w:t>2025 终止现金分层 [R_disccash_2025]：within_input_tolerance；基础单位残差 0。 原表百万美元列示精度，检验可直接复算桥；阈值以美元计。</w:t>
+      </w:r>
+    </w:p>
+    <w:p>
+      <w:r>
+        <w:t>2025 全部现金分层 [R_cashall_2025]：within_input_tolerance；基础单位残差 0。 原表百万美元列示精度，检验可直接复算桥；阈值以美元计。</w:t>
+      </w:r>
+    </w:p>
+    <w:p>
+      <w:r>
+        <w:t>2025 持续营业利润 [R_op_2025]：within_input_tolerance；基础单位残差 0。 原表百万美元列示精度，检验可直接复算桥；阈值以美元计。</w:t>
+      </w:r>
+    </w:p>
+    <w:p>
+      <w:r>
+        <w:t>2025 终止净损益 [R_discni_2025]：within_input_tolerance；基础单位残差 0。 原表百万美元列示精度，检验可直接复算桥；阈值以美元计。</w:t>
+      </w:r>
+    </w:p>
+    <w:p>
+      <w:r>
+        <w:t>2025 CFO 全桥 [R_cfo_2025]：within_input_tolerance；基础单位残差 0。 原表百万美元列示精度，检验可直接复算桥；阈值以美元计。</w:t>
+      </w:r>
+    </w:p>
+    <w:p>
+      <w:r>
+        <w:t>2025 现金滚动 [R_cashroll_2025]：within_input_tolerance；基础单位残差 0。 原表百万美元列示精度，检验可直接复算桥；阈值以美元计。</w:t>
+      </w:r>
+    </w:p>
+    <w:p>
+      <w:r>
+        <w:t>2025 权益滚动 [R_eqroll_2025]：within_input_tolerance；基础单位残差 0。 原表百万美元列示精度，检验可直接复算桥；阈值以美元计。</w:t>
+      </w:r>
+    </w:p>
+    <w:p>
+      <w:r>
+        <w:t>2024 流动资产分项合计 [R_ca_2024]：within_input_tolerance；基础单位残差 0。 原表百万美元列示精度，检验可直接复算桥；阈值以美元计。</w:t>
+      </w:r>
+    </w:p>
+    <w:p>
+      <w:r>
+        <w:t>2024 总资产分项合计 [R_assets_2024]：within_input_tolerance；基础单位残差 0。 原表百万美元列示精度，检验可直接复算桥；阈值以美元计。</w:t>
+      </w:r>
+    </w:p>
+    <w:p>
+      <w:r>
+        <w:t>2024 流动负债分项合计 [R_cl_2024]：within_input_tolerance；基础单位残差 0。 原表百万美元列示精度，检验可直接复算桥；阈值以美元计。</w:t>
+      </w:r>
+    </w:p>
+    <w:p>
+      <w:r>
+        <w:t>2024 总负债分项合计 [R_liab_2024]：within_input_tolerance；基础单位残差 0。 原表百万美元列示精度，检验可直接复算桥；阈值以美元计。</w:t>
+      </w:r>
+    </w:p>
+    <w:p>
+      <w:r>
+        <w:t>2024 权益组成 [R_eqparts_2024]：within_input_tolerance；基础单位残差 0。 原表百万美元列示精度，检验可直接复算桥；阈值以美元计。</w:t>
+      </w:r>
+    </w:p>
+    <w:p>
+      <w:r>
+        <w:t>2024 资产负债恒等式 [R_bs_2024]：within_input_tolerance；基础单位残差 0。 原表百万美元列示精度，检验可直接复算桥；阈值以美元计。</w:t>
+      </w:r>
+    </w:p>
+    <w:p>
+      <w:r>
+        <w:t>2024 持续收入组成 [R_rev_2024]：within_input_tolerance；基础单位残差 0。 原表百万美元列示精度，检验可直接复算桥；阈值以美元计。</w:t>
+      </w:r>
+    </w:p>
+    <w:p>
+      <w:r>
+        <w:t>2024 持续费用组成 [R_opex_2024]：within_input_tolerance；基础单位残差 0。 原表百万美元列示精度，检验可直接复算桥；阈值以美元计。</w:t>
+      </w:r>
+    </w:p>
+    <w:p>
+      <w:r>
+        <w:t>2024 持续税前利润桥 [R_pbt_2024]：within_input_tolerance；基础单位残差 0。 原表百万美元列示精度，检验可直接复算桥；阈值以美元计。</w:t>
+      </w:r>
+    </w:p>
+    <w:p>
+      <w:r>
+        <w:t>2024 持续净利润桥 [R_contni_2024]：within_input_tolerance；基础单位残差 0。 原表百万美元列示精度，检验可直接复算桥；阈值以美元计。</w:t>
+      </w:r>
+    </w:p>
+    <w:p>
+      <w:r>
+        <w:t>2024 持续加终止净利润 [R_net_2024]：within_input_tolerance；基础单位残差 0。 原表百万美元列示精度，检验可直接复算桥；阈值以美元计。</w:t>
+      </w:r>
+    </w:p>
+    <w:p>
+      <w:r>
+        <w:t>2024 综合收益桥 [R_comp_2024]：within_input_tolerance；基础单位残差 0。 原表百万美元列示精度，检验可直接复算桥；阈值以美元计。</w:t>
+      </w:r>
+    </w:p>
+    <w:p>
+      <w:r>
+        <w:t>2024 投资现金流组成 [R_cfi_2024]：within_input_tolerance；基础单位残差 0。 原表百万美元列示精度，检验可直接复算桥；阈值以美元计。</w:t>
+      </w:r>
+    </w:p>
+    <w:p>
+      <w:r>
+        <w:t>2024 融资现金流组成 [R_cff_2024]：within_input_tolerance；基础单位残差 0。 原表百万美元列示精度，检验可直接复算桥；阈值以美元计。</w:t>
+      </w:r>
+    </w:p>
+    <w:p>
+      <w:r>
+        <w:t>2024 三类现金流合计 [R_cashdelta_2024]：within_input_tolerance；基础单位残差 0。 原表百万美元列示精度，检验可直接复算桥；阈值以美元计。</w:t>
+      </w:r>
+    </w:p>
+    <w:p>
+      <w:r>
+        <w:t>2024 终止资产分项 [R_discassets_2024]：within_input_tolerance；基础单位残差 0。 原表百万美元列示精度，检验可直接复算桥；阈值以美元计。</w:t>
+      </w:r>
+    </w:p>
+    <w:p>
+      <w:r>
+        <w:t>2024 终止负债分项 [R_discliab_2024]：within_input_tolerance；基础单位残差 0。 原表百万美元列示精度，检验可直接复算桥；阈值以美元计。</w:t>
+      </w:r>
+    </w:p>
+    <w:p>
+      <w:r>
+        <w:t>2024 终止税前利润桥 [R_discpbt_2024]：within_input_tolerance；基础单位残差 0。 原表百万美元列示精度，检验可直接复算桥；阈值以美元计。</w:t>
+      </w:r>
+    </w:p>
+    <w:p>
+      <w:r>
+        <w:t>2024 终止处置前净利润桥 [R_discpre_2024]：within_input_tolerance；基础单位残差 0。 原表百万美元列示精度，检验可直接复算桥；阈值以美元计。</w:t>
+      </w:r>
+    </w:p>
+    <w:p>
+      <w:r>
+        <w:t>2024 持续税额调节 [R_tax_2024]：within_input_tolerance；基础单位残差 0。 原表百万美元列示精度，检验可直接复算桥；阈值以美元计。</w:t>
+      </w:r>
+    </w:p>
+    <w:p>
+      <w:r>
+        <w:t>2024 持续现金分层 [R_contcash_2024]：within_input_tolerance；基础单位残差 0。 原表百万美元列示精度，检验可直接复算桥；阈值以美元计。</w:t>
+      </w:r>
+    </w:p>
+    <w:p>
+      <w:r>
+        <w:t>2024 终止现金分层 [R_disccash_2024]：within_input_tolerance；基础单位残差 0。 原表百万美元列示精度，检验可直接复算桥；阈值以美元计。</w:t>
+      </w:r>
+    </w:p>
+    <w:p>
+      <w:r>
+        <w:t>2024 全部现金分层 [R_cashall_2024]：within_input_tolerance；基础单位残差 0。 原表百万美元列示精度，检验可直接复算桥；阈值以美元计。</w:t>
+      </w:r>
+    </w:p>
+    <w:p>
+      <w:r>
+        <w:t>2024 持续营业利润 [R_op_2024]：within_input_tolerance；基础单位残差 0。 原表百万美元列示精度，检验可直接复算桥；阈值以美元计。</w:t>
+      </w:r>
+    </w:p>
+    <w:p>
+      <w:r>
+        <w:t>2024 终止净损益 [R_discni_2024]：within_input_tolerance；基础单位残差 0。 原表百万美元列示精度，检验可直接复算桥；阈值以美元计。</w:t>
+      </w:r>
+    </w:p>
+    <w:p>
+      <w:r>
+        <w:t>2024 CFO 全桥 [R_cfo_2024]：within_input_tolerance；基础单位残差 0。 原表百万美元列示精度，检验可直接复算桥；阈值以美元计。</w:t>
+      </w:r>
+    </w:p>
+    <w:p>
+      <w:r>
+        <w:t>2024 现金滚动 [R_cashroll_2024]：within_input_tolerance；基础单位残差 0。 原表百万美元列示精度，检验可直接复算桥；阈值以美元计。</w:t>
+      </w:r>
+    </w:p>
+    <w:p>
+      <w:r>
+        <w:t>2024 权益滚动 [R_eqroll_2024]：within_input_tolerance；基础单位残差 0。 原表百万美元列示精度，检验可直接复算桥；阈值以美元计。</w:t>
+      </w:r>
+    </w:p>
+    <w:p>
+      <w:r>
+        <w:t>2025 准备与已发生费用至处置损失 [R_sale2025]：within_input_tolerance；基础单位残差 0。 原表百万美元列示精度，检验可直接复算桥；阈值以美元计。</w:t>
+      </w:r>
+    </w:p>
+    <w:p>
+      <w:r>
+        <w:t>合并商誉减值至期末余额 [R_gw2024]：within_input_tolerance；基础单位残差 0。 原表百万美元列示精度，检验可直接复算桥；阈值以美元计。</w:t>
+      </w:r>
+    </w:p>
+    <w:p>
+      <w:r>
+        <w:t>2024 原报与重列收入版本桥 [R_original_revenue]：unexplained_difference；基础单位残差 ‑2000000。 原报及重列皆原件实际读；2 百万美元差异未披露完整重列明细，零阈值保留差异，不作错报结论。</w:t>
+      </w:r>
+    </w:p>
+    <w:p>
+      <w:r>
+        <w:t>2024 原报至重列 pbt [R_recast_pbt]：within_input_tolerance；基础单位残差 0。 原表百万美元列示精度，检验可直接复算桥；阈值以美元计。</w:t>
+      </w:r>
+    </w:p>
+    <w:p>
+      <w:r>
+        <w:t>2024 原报至重列 tax [R_recast_tax]：within_input_tolerance；基础单位残差 0。 原表百万美元列示精度，检验可直接复算桥；阈值以美元计。</w:t>
+      </w:r>
+    </w:p>
+    <w:p>
+      <w:r>
+        <w:t>2024 原报至重列 ni [R_recast_ni]：within_input_tolerance；基础单位残差 0。 原表百万美元列示精度，检验可直接复算桥；阈值以美元计。</w:t>
+      </w:r>
+    </w:p>
+    <w:p>
+      <w:r>
+        <w:t>债务附注至资产负债表 [R_debt2025]：within_input_tolerance；基础单位残差 0。 原表百万美元列示精度，检验可直接复算桥；阈值以美元计。</w:t>
+      </w:r>
+    </w:p>
+    <w:p>
+      <w:r>
+        <w:t>债务分类桥 [R_debtsec2025]：within_input_tolerance；基础单位残差 0。 原表百万美元列示精度，检验可直接复算桥；阈值以美元计。</w:t>
+      </w:r>
+    </w:p>
+    <w:p>
+      <w:r>
+        <w:t>准备跨年滚动 [R_qallow]：within_input_tolerance；基础单位残差 0。 原表百万美元列示精度，检验可直接复算桥；阈值以美元计。</w:t>
+      </w:r>
+    </w:p>
+    <w:p>
+      <w:r>
+        <w:t>Q1 终止税前利润 [R_qpbt]：within_input_tolerance；基础单位残差 0。 原表百万美元列示精度，检验可直接复算桥；阈值以美元计。</w:t>
+      </w:r>
+    </w:p>
+    <w:p>
+      <w:r>
+        <w:t>Q1 终止处置前税后利润 [R_qdiscpre]：within_input_tolerance；基础单位残差 0。 原表百万美元列示精度，检验可直接复算桥；阈值以美元计。</w:t>
+      </w:r>
+    </w:p>
+    <w:p>
+      <w:r>
+        <w:t>Q1 现金分层 [R_qcash]：within_input_tolerance；基础单位残差 0。 原表百万美元列示精度，检验可直接复算桥；阈值以美元计。</w:t>
+      </w:r>
+    </w:p>
+    <w:p>
+      <w:r>
+        <w:t>Q1 债务桥 [R_qdebt]：within_input_tolerance；基础单位残差 0。 原表百万美元列示精度，检验可直接复算桥；阈值以美元计。</w:t>
+      </w:r>
+    </w:p>
+    <w:p>
+      <w:r>
+        <w:t>2025 Q1 原报准备与 SEC 回复 [R_priorallow_original]：within_input_tolerance；基础单位残差 0。 原表百万美元列示精度，检验可直接复算桥；阈值以美元计。</w:t>
+      </w:r>
+    </w:p>
+    <w:p>
+      <w:r>
+        <w:t>2026 Q1 对上年准备回述与原报桥 [R_priorallow_recalled]：unexplained_difference；基础单位残差 11000000。 同日同项跨版本比较；差额 11 百万美元保留，未知是否笔误、口径变化或其他更正。</w:t>
+      </w:r>
+    </w:p>
+    <w:p>
+      <w:r>
+        <w:t>利润变化分解 [R_nimove]：within_input_tolerance；基础单位残差 0。 原表百万美元列示精度，检验可直接复算桥；阈值以美元计。</w:t>
+      </w:r>
+    </w:p>
+    <w:p>
+      <w:r>
+        <w:t>公开备考价格—费用—偿债—剩余现金 [R_pf_cashadd]：within_input_tolerance；基础单位残差 0。 仅复算官方公开表所列百万美元精度；零阈值不代表审计门槛，残差单位美元。</w:t>
+      </w:r>
+    </w:p>
+    <w:p>
+      <w:r>
+        <w:t>公开备考现金基数加交易调整 [R_pf_cash]：within_input_tolerance；基础单位残差 0。 仅复算官方公开表所列百万美元精度；零阈值不代表审计门槛，残差单位美元。</w:t>
+      </w:r>
+    </w:p>
+    <w:p>
+      <w:r>
+        <w:t>公开备考资产调整 [R_pf_assetdelta]：within_input_tolerance；基础单位残差 0。 仅复算官方公开表所列百万美元精度；零阈值不代表审计门槛，残差单位美元。</w:t>
+      </w:r>
+    </w:p>
+    <w:p>
+      <w:r>
+        <w:t>公开备考负债调整 [R_pf_liabdelta]：within_input_tolerance；基础单位残差 0。 仅复算官方公开表所列百万美元精度；零阈值不代表审计门槛，残差单位美元。</w:t>
+      </w:r>
+    </w:p>
+    <w:p>
+      <w:r>
+        <w:t>公开备考资产/负债调整接权益 [R_pf_equitydelta]：within_input_tolerance；基础单位残差 0。 仅复算官方公开表所列百万美元精度；零阈值不代表审计门槛，残差单位美元。</w:t>
+      </w:r>
+    </w:p>
+    <w:p>
+      <w:r>
+        <w:t>公开备考历史权益加综合调整 [R_pf_equity]：within_input_tolerance；基础单位残差 0。 仅复算官方公开表所列百万美元精度；零阈值不代表审计门槛，残差单位美元。</w:t>
+      </w:r>
+    </w:p>
+    <w:p>
+      <w:r>
+        <w:t>公开备考利息行 [R_pf_interest]：within_input_tolerance；基础单位残差 0。 仅复算官方公开表所列百万美元精度；零阈值不代表审计门槛，残差单位美元。</w:t>
+      </w:r>
+    </w:p>
+    <w:p>
+      <w:r>
+        <w:t>公开备考持续经营利润 [R_pf_contni]：within_input_tolerance；基础单位残差 0。 仅复算官方公开表所列百万美元精度；零阈值不代表审计门槛，残差单位美元。</w:t>
+      </w:r>
+    </w:p>
+    <w:p>
+      <w:r>
+        <w:t>Fiber报告单元商誉滚动 [R_fibergw]：within_input_tolerance；基础单位残差 0。 仅复算官方公开表所列百万美元精度；零阈值不代表审计门槛，残差单位美元。</w:t>
+      </w:r>
+    </w:p>
+    <w:p>
+      <w:r>
+        <w:t>S&amp;P输入原报interest勾稽 [R_sp_interest]：within_input_tolerance；基础单位残差 0。 同一百万美元原表可直接复算，未扩大容差。</w:t>
+      </w:r>
+    </w:p>
+    <w:p>
+      <w:r>
+        <w:t>S&amp;P输入原报dda勾稽 [R_sp_dda]：within_input_tolerance；基础单位残差 0。 同一百万美元原表可直接复算，未扩大容差。</w:t>
+      </w:r>
+    </w:p>
+    <w:p>
+      <w:r>
+        <w:t>S&amp;P输入原报aro勾稽 [R_sp_aro]：within_input_tolerance；基础单位残差 0。 同一百万美元原表可直接复算，未扩大容差。</w:t>
+      </w:r>
+    </w:p>
+    <w:p>
+      <w:r>
+        <w:br w:type="page"/>
+      </w:r>
+    </w:p>
+    <w:p>
+      <w:pPr>
+        <w:pStyle w:val="Heading1"/>
+      </w:pPr>
+      <w:r>
+        <w:t>Crown Castle持续经营财务方法桥 [Q_sp_crown]</w:t>
+      </w:r>
+    </w:p>
+    <w:p>
+      <w:r>
+        <w:t>S&amp;P Ratios and Adjustments 2025-12-17；案例专用Decimal复算；截至 2026-06-30。</w:t>
+      </w:r>
+    </w:p>
+    <w:p>
+      <w:r>
+        <w:t>已运行专门结果快照；本次导出未重新计算或校验。输入或方法改变后须重跑专门脚本并重新导出。</w:t>
+      </w:r>
+    </w:p>
+    <w:tbl>
+      <w:tblPr>
+        <w:tblStyle w:val="TableGrid"/>
+        <w:tblW w:type="auto" w:w="0"/>
+        <w:tblLayout w:type="fixed"/>
+        <w:tblLook w:firstColumn="1" w:firstRow="1" w:lastColumn="0" w:lastRow="0" w:noHBand="0" w:noVBand="1" w:val="04A0"/>
+        <w:tblBorders>
+          <w:top w:val="single" w:sz="4" w:color="D9D9D9"/>
+          <w:left w:val="single" w:sz="4" w:color="D9D9D9"/>
+          <w:bottom w:val="single" w:sz="4" w:color="D9D9D9"/>
+          <w:right w:val="single" w:sz="4" w:color="D9D9D9"/>
+          <w:insideH w:val="single" w:sz="4" w:color="D9D9D9"/>
+          <w:insideV w:val="single" w:sz="4" w:color="D9D9D9"/>
+        </w:tblBorders>
+      </w:tblPr>
+      <w:tblGrid>
+        <w:gridCol w:w="3411"/>
+        <w:gridCol w:w="4386"/>
+        <w:gridCol w:w="1949"/>
+      </w:tblGrid>
+      <w:tr>
+        <w:trPr>
+          <w:tblHeader/>
+          <w:cantSplit/>
+        </w:trPr>
+        <w:tc>
+          <w:tcPr>
+            <w:tcW w:type="dxa" w:w="3411"/>
+            <w:shd w:fill="E6EEF0"/>
+          </w:tcPr>
+          <w:p>
+            <w:pPr>
+              <w:keepNext/>
+            </w:pPr>
+            <w:r>
+              <w:t>指标</w:t>
+            </w:r>
+          </w:p>
+        </w:tc>
+        <w:tc>
+          <w:tcPr>
+            <w:tcW w:type="dxa" w:w="4386"/>
+            <w:shd w:fill="E6EEF0"/>
+          </w:tcPr>
+          <w:p>
+            <w:pPr>
+              <w:keepNext/>
+            </w:pPr>
+            <w:r>
+              <w:t>结果及单位</w:t>
+            </w:r>
+          </w:p>
+        </w:tc>
+        <w:tc>
+          <w:tcPr>
+            <w:tcW w:type="dxa" w:w="1949"/>
+            <w:shd w:fill="E6EEF0"/>
+          </w:tcPr>
+          <w:p>
+            <w:pPr>
+              <w:keepNext/>
+            </w:pPr>
+            <w:r>
+              <w:t>底稿引用</w:t>
+            </w:r>
+          </w:p>
+        </w:tc>
+      </w:tr>
+      <w:tr>
+        <w:trPr>
+          <w:cantSplit/>
+        </w:trPr>
+        <w:tc>
+          <w:tcPr>
+            <w:tcW w:type="dxa" w:w="3411"/>
+          </w:tcPr>
+          <w:p>
+            <w:r>
+              <w:t>经营租赁利息代理</w:t>
+            </w:r>
+          </w:p>
+        </w:tc>
+        <w:tc>
+          <w:tcPr>
+            <w:tcW w:type="dxa" w:w="4386"/>
+          </w:tcPr>
+          <w:p>
+            <w:r>
+              <w:t>274.43 百万USD</w:t>
+            </w:r>
+          </w:p>
+        </w:tc>
+        <w:tc>
+          <w:tcPr>
+            <w:tcW w:type="dxa" w:w="1949"/>
+          </w:tcPr>
+          <w:p>
+            <w:r>
+              <w:t>sp_lease_interest</w:t>
+            </w:r>
+          </w:p>
+        </w:tc>
+      </w:tr>
+      <w:tr>
+        <w:trPr>
+          <w:cantSplit/>
+        </w:trPr>
+        <w:tc>
+          <w:tcPr>
+            <w:tcW w:type="dxa" w:w="3411"/>
+          </w:tcPr>
+          <w:p>
+            <w:r>
+              <w:t>经营租赁折旧及CFO加回代理</w:t>
+            </w:r>
+          </w:p>
+        </w:tc>
+        <w:tc>
+          <w:tcPr>
+            <w:tcW w:type="dxa" w:w="4386"/>
+          </w:tcPr>
+          <w:p>
+            <w:r>
+              <w:t>324.57 百万USD</w:t>
+            </w:r>
+          </w:p>
+        </w:tc>
+        <w:tc>
+          <w:tcPr>
+            <w:tcW w:type="dxa" w:w="1949"/>
+          </w:tcPr>
+          <w:p>
+            <w:r>
+              <w:t>sp_lease_principal_proxy</w:t>
+            </w:r>
+          </w:p>
+        </w:tc>
+      </w:tr>
+      <w:tr>
+        <w:trPr>
+          <w:cantSplit/>
+        </w:trPr>
+        <w:tc>
+          <w:tcPr>
+            <w:tcW w:type="dxa" w:w="3411"/>
+          </w:tcPr>
+          <w:p>
+            <w:r>
+              <w:t>S&amp;P口径EBITDA分析估计</w:t>
+            </w:r>
+          </w:p>
+        </w:tc>
+        <w:tc>
+          <w:tcPr>
+            <w:tcW w:type="dxa" w:w="4386"/>
+          </w:tcPr>
+          <w:p>
+            <w:r>
+              <w:t>3,448.00 百万USD</w:t>
+            </w:r>
+          </w:p>
+        </w:tc>
+        <w:tc>
+          <w:tcPr>
+            <w:tcW w:type="dxa" w:w="1949"/>
+          </w:tcPr>
+          <w:p>
+            <w:r>
+              <w:t>sp_ebitda</w:t>
+            </w:r>
+          </w:p>
+        </w:tc>
+      </w:tr>
+      <w:tr>
+        <w:trPr>
+          <w:cantSplit/>
+        </w:trPr>
+        <w:tc>
+          <w:tcPr>
+            <w:tcW w:type="dxa" w:w="3411"/>
+          </w:tcPr>
+          <w:p>
+            <w:r>
+              <w:t>应计利息已识别调整小计</w:t>
+            </w:r>
+          </w:p>
+        </w:tc>
+        <w:tc>
+          <w:tcPr>
+            <w:tcW w:type="dxa" w:w="4386"/>
+          </w:tcPr>
+          <w:p>
+            <w:r>
+              <w:t>1,286.43 百万USD</w:t>
+            </w:r>
+          </w:p>
+        </w:tc>
+        <w:tc>
+          <w:tcPr>
+            <w:tcW w:type="dxa" w:w="1949"/>
+          </w:tcPr>
+          <w:p>
+            <w:r>
+              <w:t>sp_accrual_interest</w:t>
+            </w:r>
+          </w:p>
+        </w:tc>
+      </w:tr>
+      <w:tr>
+        <w:trPr>
+          <w:cantSplit/>
+        </w:trPr>
+        <w:tc>
+          <w:tcPr>
+            <w:tcW w:type="dxa" w:w="3411"/>
+          </w:tcPr>
+          <w:p>
+            <w:r>
+              <w:t>现金利息分析估计（含租赁代理）</w:t>
+            </w:r>
+          </w:p>
+        </w:tc>
+        <w:tc>
+          <w:tcPr>
+            <w:tcW w:type="dxa" w:w="4386"/>
+          </w:tcPr>
+          <w:p>
+            <w:r>
+              <w:t>1,254.43 百万USD</w:t>
+            </w:r>
+          </w:p>
+        </w:tc>
+        <w:tc>
+          <w:tcPr>
+            <w:tcW w:type="dxa" w:w="1949"/>
+          </w:tcPr>
+          <w:p>
+            <w:r>
+              <w:t>sp_cash_interest</w:t>
+            </w:r>
+          </w:p>
+        </w:tc>
+      </w:tr>
+      <w:tr>
+        <w:trPr>
+          <w:cantSplit/>
+        </w:trPr>
+        <w:tc>
+          <w:tcPr>
+            <w:tcW w:type="dxa" w:w="3411"/>
+          </w:tcPr>
+          <w:p>
+            <w:r>
+              <w:t>FFO分析估计</w:t>
+            </w:r>
+          </w:p>
+        </w:tc>
+        <w:tc>
+          <w:tcPr>
+            <w:tcW w:type="dxa" w:w="4386"/>
+          </w:tcPr>
+          <w:p>
+            <w:r>
+              <w:t>2,178.57 百万USD</w:t>
+            </w:r>
+          </w:p>
+        </w:tc>
+        <w:tc>
+          <w:tcPr>
+            <w:tcW w:type="dxa" w:w="1949"/>
+          </w:tcPr>
+          <w:p>
+            <w:r>
+              <w:t>sp_ffo</w:t>
+            </w:r>
+          </w:p>
+        </w:tc>
+      </w:tr>
+      <w:tr>
+        <w:trPr>
+          <w:cantSplit/>
+        </w:trPr>
+        <w:tc>
+          <w:tcPr>
+            <w:tcW w:type="dxa" w:w="3411"/>
+          </w:tcPr>
+          <w:p>
+            <w:r>
+              <w:t>CFO分析估计</w:t>
+            </w:r>
+          </w:p>
+        </w:tc>
+        <w:tc>
+          <w:tcPr>
+            <w:tcW w:type="dxa" w:w="4386"/>
+          </w:tcPr>
+          <w:p>
+            <w:r>
+              <w:t>2,181.57 百万USD</w:t>
+            </w:r>
+          </w:p>
+        </w:tc>
+        <w:tc>
+          <w:tcPr>
+            <w:tcW w:type="dxa" w:w="1949"/>
+          </w:tcPr>
+          <w:p>
+            <w:r>
+              <w:t>sp_cfo</w:t>
+            </w:r>
+          </w:p>
+        </w:tc>
+      </w:tr>
+      <w:tr>
+        <w:trPr>
+          <w:cantSplit/>
+        </w:trPr>
+        <w:tc>
+          <w:tcPr>
+            <w:tcW w:type="dxa" w:w="3411"/>
+          </w:tcPr>
+          <w:p>
+            <w:r>
+              <w:t>资本支出分析估计（移出资本化现金利息）</w:t>
+            </w:r>
+          </w:p>
+        </w:tc>
+        <w:tc>
+          <w:tcPr>
+            <w:tcW w:type="dxa" w:w="4386"/>
+          </w:tcPr>
+          <w:p>
+            <w:r>
+              <w:t>167.00 百万USD</w:t>
+            </w:r>
+          </w:p>
+        </w:tc>
+        <w:tc>
+          <w:tcPr>
+            <w:tcW w:type="dxa" w:w="1949"/>
+          </w:tcPr>
+          <w:p>
+            <w:r>
+              <w:t>sp_capex</w:t>
+            </w:r>
+          </w:p>
+        </w:tc>
+      </w:tr>
+      <w:tr>
+        <w:trPr>
+          <w:cantSplit/>
+        </w:trPr>
+        <w:tc>
+          <w:tcPr>
+            <w:tcW w:type="dxa" w:w="3411"/>
+          </w:tcPr>
+          <w:p>
+            <w:r>
+              <w:t>FOCF分析估计（尚非付完全部租赁本金的现金）</w:t>
+            </w:r>
+          </w:p>
+        </w:tc>
+        <w:tc>
+          <w:tcPr>
+            <w:tcW w:type="dxa" w:w="4386"/>
+          </w:tcPr>
+          <w:p>
+            <w:r>
+              <w:t>2,014.57 百万USD</w:t>
+            </w:r>
+          </w:p>
+        </w:tc>
+        <w:tc>
+          <w:tcPr>
+            <w:tcW w:type="dxa" w:w="1949"/>
+          </w:tcPr>
+          <w:p>
+            <w:r>
+              <w:t>sp_focf</w:t>
+            </w:r>
+          </w:p>
+        </w:tc>
+      </w:tr>
+      <w:tr>
+        <w:trPr>
+          <w:cantSplit/>
+        </w:trPr>
+        <w:tc>
+          <w:tcPr>
+            <w:tcW w:type="dxa" w:w="3411"/>
+          </w:tcPr>
+          <w:p>
+            <w:r>
+              <w:t>仅加回已直接证实RSU的EBITDA敏感性</w:t>
+            </w:r>
+          </w:p>
+        </w:tc>
+        <w:tc>
+          <w:tcPr>
+            <w:tcW w:type="dxa" w:w="4386"/>
+          </w:tcPr>
+          <w:p>
+            <w:r>
+              <w:t>3,436.00 百万USD</w:t>
+            </w:r>
+          </w:p>
+        </w:tc>
+        <w:tc>
+          <w:tcPr>
+            <w:tcW w:type="dxa" w:w="1949"/>
+          </w:tcPr>
+          <w:p>
+            <w:r>
+              <w:t>sp_ebitda_rsu</w:t>
+            </w:r>
+          </w:p>
+        </w:tc>
+      </w:tr>
+      <w:tr>
+        <w:trPr>
+          <w:cantSplit/>
+        </w:trPr>
+        <w:tc>
+          <w:tcPr>
+            <w:tcW w:type="dxa" w:w="3411"/>
+          </w:tcPr>
+          <w:p>
+            <w:r>
+              <w:t>仅加回已直接证实RSU的FFO敏感性</w:t>
+            </w:r>
+          </w:p>
+        </w:tc>
+        <w:tc>
+          <w:tcPr>
+            <w:tcW w:type="dxa" w:w="4386"/>
+          </w:tcPr>
+          <w:p>
+            <w:r>
+              <w:t>2,166.57 百万USD</w:t>
+            </w:r>
+          </w:p>
+        </w:tc>
+        <w:tc>
+          <w:tcPr>
+            <w:tcW w:type="dxa" w:w="1949"/>
+          </w:tcPr>
+          <w:p>
+            <w:r>
+              <w:t>sp_ffo_rsu</w:t>
+            </w:r>
+          </w:p>
+        </w:tc>
+      </w:tr>
+      <w:tr>
+        <w:trPr>
+          <w:cantSplit/>
+        </w:trPr>
+        <w:tc>
+          <w:tcPr>
+            <w:tcW w:type="dxa" w:w="3411"/>
+          </w:tcPr>
+          <w:p>
+            <w:r>
+              <w:t>采用PP&amp;E核销总额的EBITDA敏感性</w:t>
+            </w:r>
+          </w:p>
+        </w:tc>
+        <w:tc>
+          <w:tcPr>
+            <w:tcW w:type="dxa" w:w="4386"/>
+          </w:tcPr>
+          <w:p>
+            <w:r>
+              <w:t>3,449.00 百万USD</w:t>
+            </w:r>
+          </w:p>
+        </w:tc>
+        <w:tc>
+          <w:tcPr>
+            <w:tcW w:type="dxa" w:w="1949"/>
+          </w:tcPr>
+          <w:p>
+            <w:r>
+              <w:t>sp_ebitda_writeoff</w:t>
+            </w:r>
+          </w:p>
+        </w:tc>
+      </w:tr>
+      <w:tr>
+        <w:trPr>
+          <w:cantSplit/>
+        </w:trPr>
+        <w:tc>
+          <w:tcPr>
+            <w:tcW w:type="dxa" w:w="3411"/>
+          </w:tcPr>
+          <w:p>
+            <w:r>
+              <w:t>债务分析估计（ARO尚未抵减）</w:t>
+            </w:r>
+          </w:p>
+        </w:tc>
+        <w:tc>
+          <w:tcPr>
+            <w:tcW w:type="dxa" w:w="4386"/>
+          </w:tcPr>
+          <w:p>
+            <w:r>
+              <w:t>29,888.00 百万USD</w:t>
+            </w:r>
+          </w:p>
+        </w:tc>
+        <w:tc>
+          <w:tcPr>
+            <w:tcW w:type="dxa" w:w="1949"/>
+          </w:tcPr>
+          <w:p>
+            <w:r>
+              <w:t>sp_gross_debt</w:t>
+            </w:r>
+          </w:p>
+        </w:tc>
+      </w:tr>
+      <w:tr>
+        <w:trPr>
+          <w:cantSplit/>
+        </w:trPr>
+        <w:tc>
+          <w:tcPr>
+            <w:tcW w:type="dxa" w:w="3411"/>
+          </w:tcPr>
+          <w:p>
+            <w:r>
+              <w:t>仅扣99合格现金的条件债务</w:t>
+            </w:r>
+          </w:p>
+        </w:tc>
+        <w:tc>
+          <w:tcPr>
+            <w:tcW w:type="dxa" w:w="4386"/>
+          </w:tcPr>
+          <w:p>
+            <w:r>
+              <w:t>29,789.00 百万USD</w:t>
+            </w:r>
+          </w:p>
+        </w:tc>
+        <w:tc>
+          <w:tcPr>
+            <w:tcW w:type="dxa" w:w="1949"/>
+          </w:tcPr>
+          <w:p>
+            <w:r>
+              <w:t>sp_net_debt</w:t>
+            </w:r>
+          </w:p>
+        </w:tc>
+      </w:tr>
+      <w:tr>
+        <w:trPr>
+          <w:cantSplit/>
+        </w:trPr>
+        <w:tc>
+          <w:tcPr>
+            <w:tcW w:type="dxa" w:w="3411"/>
+          </w:tcPr>
+          <w:p>
+            <w:r>
+              <w:t>2025历史条件债务/EBITDA</w:t>
+            </w:r>
+          </w:p>
+        </w:tc>
+        <w:tc>
+          <w:tcPr>
+            <w:tcW w:type="dxa" w:w="4386"/>
+          </w:tcPr>
+          <w:p>
+            <w:r>
+              <w:t>8.64 倍</w:t>
+            </w:r>
+          </w:p>
+        </w:tc>
+        <w:tc>
+          <w:tcPr>
+            <w:tcW w:type="dxa" w:w="1949"/>
+          </w:tcPr>
+          <w:p>
+            <w:r>
+              <w:t>sp_leverage</w:t>
+            </w:r>
+          </w:p>
+        </w:tc>
+      </w:tr>
+      <w:tr>
+        <w:trPr>
+          <w:cantSplit/>
+        </w:trPr>
+        <w:tc>
+          <w:tcPr>
+            <w:tcW w:type="dxa" w:w="3411"/>
+          </w:tcPr>
+          <w:p>
+            <w:r>
+              <w:t>2025历史条件FFO/债务</w:t>
+            </w:r>
+          </w:p>
+        </w:tc>
+        <w:tc>
+          <w:tcPr>
+            <w:tcW w:type="dxa" w:w="4386"/>
+          </w:tcPr>
+          <w:p>
+            <w:r>
+              <w:t>7.31%</w:t>
+            </w:r>
+          </w:p>
+        </w:tc>
+        <w:tc>
+          <w:tcPr>
+            <w:tcW w:type="dxa" w:w="1949"/>
+          </w:tcPr>
+          <w:p>
+            <w:r>
+              <w:t>sp_ffo_debt</w:t>
+            </w:r>
+          </w:p>
+        </w:tc>
+      </w:tr>
+      <w:tr>
+        <w:trPr>
+          <w:cantSplit/>
+        </w:trPr>
+        <w:tc>
+          <w:tcPr>
+            <w:tcW w:type="dxa" w:w="3411"/>
+          </w:tcPr>
+          <w:p>
+            <w:r>
+              <w:t>股份支付差额对EBITDA的影响</w:t>
+            </w:r>
+          </w:p>
+        </w:tc>
+        <w:tc>
+          <w:tcPr>
+            <w:tcW w:type="dxa" w:w="4386"/>
+          </w:tcPr>
+          <w:p>
+            <w:r>
+              <w:t>0.35%</w:t>
+            </w:r>
+          </w:p>
+        </w:tc>
+        <w:tc>
+          <w:tcPr>
+            <w:tcW w:type="dxa" w:w="1949"/>
+          </w:tcPr>
+          <w:p>
+            <w:r>
+              <w:t>sp_sbc_effect</w:t>
+            </w:r>
+          </w:p>
+        </w:tc>
+      </w:tr>
+    </w:tbl>
+    <w:p/>
+    <w:p>
+      <w:r>
+        <w:t>此处仅汇总声明的指标；全部结果行、公式和未舍入值保留在工作簿及结果JSON。</w:t>
+      </w:r>
+    </w:p>
+    <w:p>
+      <w:r>
+        <w:t>证据记录：E_SP_RATIOS, E_SP_SCOPE, E_SP_LEASE, E_SP_CASH, E_SP_SBC, E_SP_ARO, E_SP_XBRL</w:t>
       </w:r>
     </w:p>
     <w:p>
@@ -2737,32 +4124,50 @@
         <w:pStyle w:val="Heading2"/>
       </w:pPr>
       <w:r>
-        <w:t>P03 复算四表及税现金桥</w:t>
-      </w:r>
-    </w:p>
-    <w:p>
-      <w:r>
-        <w:t>状态 performed；认定 披露一致性、计算准确性、期间及范围；总体 上述来源已明确定位的公开页面与表格，非企业交易总体；选取 围绕交易、四表及资金债务的针对性选取；不是统计审计抽样。</w:t>
-      </w:r>
-    </w:p>
-    <w:p>
-      <w:r>
-        <w:t>读取并视觉核对年报四表和现金调节表</w:t>
-      </w:r>
-    </w:p>
-    <w:p>
-      <w:r>
-        <w:t>用现有 calculate.evaluate 复算加总、损益—现金—权益及资产负债恒等式</w:t>
-      </w:r>
-    </w:p>
-    <w:p>
-      <w:r>
-        <w:t>检验现金单位/期初期末/终止范围，保留输出差额</w:t>
-      </w:r>
-    </w:p>
-    <w:p>
-      <w:r>
-        <w:t>实际结果：四表列示加总和滚动复算；算术结果另存 results.json，非审计意见。；证据 E25BS, E25PL, E25CF, E25EQ, E25TAX, E25CASH。</w:t>
+        <w:t>假设与适用限制</w:t>
+      </w:r>
+    </w:p>
+    <w:p>
+      <w:r>
+        <w:t>资本化现金付息以同年已披露应计资本化利息估计，原报值与估计分列；改变该估计时FFO和CFO同额反向变动，资本支出同额反向变动，FOCF不变。</w:t>
+      </w:r>
+    </w:p>
+    <w:p>
+      <w:r>
+        <w:t>股份支付全部作为权益结算、资产净减记全部作为非流动项是有披露支持的分析估计；RSU已直接证实，余项另给敏感性。内部使用软件按适用方法不反转。</w:t>
+      </w:r>
+    </w:p>
+    <w:p>
+      <w:r>
+        <w:t>ARO先采用未抵减负债的分析估计；税益、专款和残值尚未量化。条件净债仅扣普通现金，并以其符合方法可动用条件为前提。</w:t>
+      </w:r>
+    </w:p>
+    <w:p>
+      <w:r>
+        <w:t>指标是按已识别事项形成的分析估计，不是S&amp;P发表的发行人指标或会计报表重述；不构成主体或债项等级。</w:t>
+      </w:r>
+    </w:p>
+    <w:p>
+      <w:r>
+        <w:t>历史2025持续经营利润与当年末保留债务配套；未把2026实际出售收款直接从历史债务扣除。</w:t>
+      </w:r>
+    </w:p>
+    <w:p>
+      <w:r>
+        <w:t>租赁CFO加回是方法分类代理，不等于实际付款，也不增加可支用现金。受限现金用途及最终售后债务现金仍需独立取证。</w:t>
+      </w:r>
+    </w:p>
+    <w:p>
+      <w:r>
+        <w:t>完整结果、输入快照与复算信息见 Excel Q1/Quant1 系列工作表及 quantitative-Q_sp_crown.json。</w:t>
+      </w:r>
+    </w:p>
+    <w:p>
+      <w:pPr>
+        <w:pStyle w:val="Heading1"/>
+      </w:pPr>
+      <w:r>
+        <w:t>已执行程序与待核工作</w:t>
       </w:r>
     </w:p>
     <w:p>
@@ -2770,7 +4175,7 @@
         <w:pStyle w:val="Heading2"/>
       </w:pPr>
       <w:r>
-        <w:t>P04 核验原报与重列版本</w:t>
+        <w:t>P01 核实减值先后及测试单元</w:t>
       </w:r>
     </w:p>
     <w:p>
@@ -2780,22 +4185,32 @@
     </w:p>
     <w:p>
       <w:r>
-        <w:t>读原 2024 年报损益及分部表，并视觉复核</w:t>
-      </w:r>
-    </w:p>
-    <w:p>
-      <w:r>
-        <w:t>对比 2025 年报 2024 持续和终止列；分别核验收入、税前利润、税、净利润</w:t>
-      </w:r>
-    </w:p>
-    <w:p>
-      <w:r>
-        <w:t>读 2025 Q1 原 note 3、SEC 回复和 2026 Q1 脚注，保持来源版本</w:t>
-      </w:r>
-    </w:p>
-    <w:p>
-      <w:r>
-        <w:t>实际结果：两处版本差异保留并请求解释，没有替换原文数字。；证据 E24ORIG, EQ125, ESECSALE, EQ126HFS, C_recastrev2024, C_priorallow。</w:t>
+        <w:t>读 2024 年报政策、商誉滚动和资产核销段落</w:t>
+      </w:r>
+    </w:p>
+    <w:p>
+      <w:r>
+        <w:t>读 SEC 问询回复关于测试顺序、资产组、CBSA 及计量基础的说明</w:t>
+      </w:r>
+    </w:p>
+    <w:p>
+      <w:r>
+        <w:t>读 FASB ASU 2017-04 选定条款并视觉区分增删标记，不把 ASU 称权威 Codification</w:t>
+      </w:r>
+    </w:p>
+    <w:p>
+      <w:r>
+        <w:t>复算商誉期初减费用至期末</w:t>
+      </w:r>
+    </w:p>
+    <w:p>
+      <w:r>
+        <w:t>重新读note5/p75并核图像：Fiber4,958至0、Towers5,127不变；更正合并标签并复算分部桥</w:t>
+      </w:r>
+    </w:p>
+    <w:p>
+      <w:r>
+        <w:t>实际结果：公开披露顺序与算术支持；未取得模型，未重新执行估值。；证据 E24IMPAIR, E24WRITE, ESECSEQ, EFASB, C_gw2024, C_fibergw。</w:t>
       </w:r>
     </w:p>
     <w:p>
@@ -2803,7 +4218,7 @@
         <w:pStyle w:val="Heading2"/>
       </w:pPr>
       <w:r>
-        <w:t>P05 验证出售与偿债时间界线</w:t>
+        <w:t>P02 验证持有待售损失组成</w:t>
       </w:r>
     </w:p>
     <w:p>
@@ -2813,32 +4228,27 @@
     </w:p>
     <w:p>
       <w:r>
-        <w:t>读五月一日完成公告和五月七日 Q1 报告期后附注</w:t>
-      </w:r>
-    </w:p>
-    <w:p>
-      <w:r>
-        <w:t>将三月准备滚动、交割价调、已预提成本支付、实际及计划偿债分开</w:t>
-      </w:r>
-    </w:p>
-    <w:p>
-      <w:r>
-        <w:t>排除七月及之后发表的 Q2 结果</w:t>
-      </w:r>
-    </w:p>
-    <w:p>
-      <w:r>
-        <w:t>实际读出售8-K Ex99.2 p18–21及Note2(A)–(E)，将发表日、BS/损益假设日、五月实际/计划逐层区分</w:t>
-      </w:r>
-    </w:p>
-    <w:p>
-      <w:r>
-        <w:t>复算公开备考现金、资产/负债调整接权益、利息和持续经营利润；保留834行原始标签差异</w:t>
-      </w:r>
-    </w:p>
-    <w:p>
-      <w:r>
-        <w:t>实际结果：实际约数和备考均各有来源：备考现金调整6,247、现金6,346、权益‑1,796、持续利润1,188闭合；未将其认作五月实际现金、最终处置损益或契约EBITDA。；证据 ESALE, EQ126SALE, C_qallow, C_saleproceeds, EPROBASIS, EPROBS, EPROPL, ESALEVERSION, C_pf_cashadd, C_pf_equity, C_pf_contni。</w:t>
+        <w:t>读年报 note 3 及脚注，逐页图像核对金额与列头</w:t>
+      </w:r>
+    </w:p>
+    <w:p>
+      <w:r>
+        <w:t>把准备与售出费用同表损失勾稽；分别保留税、现金及范围</w:t>
+      </w:r>
+    </w:p>
+    <w:p>
+      <w:r>
+        <w:t>实际补读最初签署协议§2.2–2.7及所用定义，区分公开机制、未公开附表和实际结算</w:t>
+      </w:r>
+    </w:p>
+    <w:p>
+      <w:r>
+        <w:t>读取五月公开备考，明确不能倒填2025年末89差额；检查已读官方索引的修订信息</w:t>
+      </w:r>
+    </w:p>
+    <w:p>
+      <w:r>
+        <w:t>实际结果：分类与2025损失桥保留；公开价格/结算机制及备考已取得，年末89差额、实际结算和未识别修订影响仍未解释。；证据 E25HFS, ESECSALE, C_sale2025, ESPAPRICE, ESPASETTLE, EPROBS, EQ126INDEX。</w:t>
       </w:r>
     </w:p>
     <w:p>
@@ -2846,7 +4256,7 @@
         <w:pStyle w:val="Heading2"/>
       </w:pPr>
       <w:r>
-        <w:t>P06 阅读新旧融资资源与定义</w:t>
+        <w:t>P03 复算四表及税现金桥</w:t>
       </w:r>
     </w:p>
     <w:p>
@@ -2856,32 +4266,22 @@
     </w:p>
     <w:p>
       <w:r>
-        <w:t>阅读年报债务表、契约报告和隔离实体说明</w:t>
-      </w:r>
-    </w:p>
-    <w:p>
-      <w:r>
-        <w:t>读新协议 §1.01、1.04、1.05、4.02、6.10，复核替代关系及提款约束</w:t>
-      </w:r>
-    </w:p>
-    <w:p>
-      <w:r>
-        <w:t>分开账面值、本金、旧未提额度、CP 备用占用及新信用证</w:t>
-      </w:r>
-    </w:p>
-    <w:p>
-      <w:r>
-        <w:t>补读2022 Amendment7附后旧协议指定定义及§1.04/1.05/6.09/6.10，与新原文分别核对</w:t>
-      </w:r>
-    </w:p>
-    <w:p>
-      <w:r>
-        <w:t>读2025年报和2026Q1附件索引、五月新8-K终止条款，有限检索截止前后续版本；无证据不推定不存在未公开修订</w:t>
-      </w:r>
-    </w:p>
-    <w:p>
-      <w:r>
-        <w:t>实际结果：旧新主信贷选定条款链现已补齐；旧待售例外和租赁/债务口径分别标明。内部缺口限数值调整、合规证明及非公开条款，未声称检查所有SPE票据契约。；证据 E25DEBT, E25COV, E25SPE, ECREDIT, C_oldnetavailability, C_newnetLC, EOLDCREDIT, EOLDVERSION, EQ126INDEX。</w:t>
+        <w:t>读取并视觉核对年报四表和现金调节表</w:t>
+      </w:r>
+    </w:p>
+    <w:p>
+      <w:r>
+        <w:t>用现有 calculate.evaluate 复算加总、损益—现金—权益及资产负债恒等式</w:t>
+      </w:r>
+    </w:p>
+    <w:p>
+      <w:r>
+        <w:t>检验现金单位/期初期末/终止范围，保留输出差额</w:t>
+      </w:r>
+    </w:p>
+    <w:p>
+      <w:r>
+        <w:t>实际结果：四表列示加总和滚动复算；算术结果另存 results.json，非审计意见。；证据 E25BS, E25PL, E25CF, E25EQ, E25TAX, E25CASH。</w:t>
       </w:r>
     </w:p>
     <w:p>
@@ -2889,7 +4289,7 @@
         <w:pStyle w:val="Heading2"/>
       </w:pPr>
       <w:r>
-        <w:t>P07 寻找不利证据</w:t>
+        <w:t>P04 核验原报与重列版本</w:t>
       </w:r>
     </w:p>
     <w:p>
@@ -2899,17 +4299,22 @@
     </w:p>
     <w:p>
       <w:r>
-        <w:t>读 DISH 期后披露及现金/收入确认含义</w:t>
-      </w:r>
-    </w:p>
-    <w:p>
-      <w:r>
-        <w:t>将公司可收回判断与独立收款证据区分</w:t>
-      </w:r>
-    </w:p>
-    <w:p>
-      <w:r>
-        <w:t>实际结果：将应收收回风险作为反证；未进行法律或收款函证。；证据 EDISH。</w:t>
+        <w:t>读原 2024 年报损益及分部表，并视觉复核</w:t>
+      </w:r>
+    </w:p>
+    <w:p>
+      <w:r>
+        <w:t>对比 2025 年报 2024 持续和终止列；分别核验收入、税前利润、税、净利润</w:t>
+      </w:r>
+    </w:p>
+    <w:p>
+      <w:r>
+        <w:t>读 2025 Q1 原 note 3、SEC 回复和 2026 Q1 脚注，保持来源版本</w:t>
+      </w:r>
+    </w:p>
+    <w:p>
+      <w:r>
+        <w:t>实际结果：两处版本差异保留并请求解释，没有替换原文数字。；证据 E24ORIG, EQ125, ESECSALE, EQ126HFS, C_recastrev2024, C_priorallow。</w:t>
       </w:r>
     </w:p>
     <w:p>
@@ -2917,17 +4322,42 @@
         <w:pStyle w:val="Heading2"/>
       </w:pPr>
       <w:r>
-        <w:t>Q01 待补资料</w:t>
-      </w:r>
-    </w:p>
-    <w:p>
-      <w:r>
-        <w:t>资产组/报告单元组织图、长期资产账面基数、未折现预测、商誉 DCF/市场法、税属性及敏感性</w:t>
-      </w:r>
-    </w:p>
-    <w:p>
-      <w:r>
-        <w:t>影响：不能从公司结论独立重做可收回性或公允价值。责任角色：财务估值/业务预算负责人。关闭条件：取得可追溯模型、董事会预算及实际回测，按正确顺序重做并解释余量</w:t>
+        <w:t>P05 验证出售与偿债时间界线</w:t>
+      </w:r>
+    </w:p>
+    <w:p>
+      <w:r>
+        <w:t>状态 performed；认定 披露一致性、计算准确性、期间及范围；总体 上述来源已明确定位的公开页面与表格，非企业交易总体；选取 围绕交易、四表及资金债务的针对性选取；不是统计审计抽样。</w:t>
+      </w:r>
+    </w:p>
+    <w:p>
+      <w:r>
+        <w:t>读五月一日完成公告和五月七日 Q1 报告期后附注</w:t>
+      </w:r>
+    </w:p>
+    <w:p>
+      <w:r>
+        <w:t>将三月准备滚动、交割价调、已预提成本支付、实际及计划偿债分开</w:t>
+      </w:r>
+    </w:p>
+    <w:p>
+      <w:r>
+        <w:t>排除七月及之后发表的 Q2 结果</w:t>
+      </w:r>
+    </w:p>
+    <w:p>
+      <w:r>
+        <w:t>实际读出售8-K Ex99.2 p18–21及Note2(A)–(E)，将发表日、BS/损益假设日、五月实际/计划逐层区分</w:t>
+      </w:r>
+    </w:p>
+    <w:p>
+      <w:r>
+        <w:t>复算公开备考现金、资产/负债调整接权益、利息和持续经营利润；保留834行原始标签差异</w:t>
+      </w:r>
+    </w:p>
+    <w:p>
+      <w:r>
+        <w:t>实际结果：实际约数和备考均各有来源：备考现金调整6,247、现金6,346、权益‑1,796、持续利润1,188闭合；未将其认作五月实际现金、最终处置损益或契约EBITDA。；证据 ESALE, EQ126SALE, C_qallow, C_saleproceeds, EPROBASIS, EPROBS, EPROPL, ESALEVERSION, C_pf_cashadd, C_pf_equity, C_pf_contni。</w:t>
       </w:r>
     </w:p>
     <w:p>
@@ -2935,17 +4365,42 @@
         <w:pStyle w:val="Heading2"/>
       </w:pPr>
       <w:r>
-        <w:t>Q02 待补资料</w:t>
-      </w:r>
-    </w:p>
-    <w:p>
-      <w:r>
-        <w:t>分类日内部会计备忘录、公开原件省略的ScheduleII/VI等附表及出售估值/费用明细、准备滚动；实际适用但未在已取得的公开原件找到的签署修订</w:t>
-      </w:r>
-    </w:p>
-    <w:p>
-      <w:r>
-        <w:t>影响：最初签署协议及§2.2–2.7机制已读；公开备考不能解释2025年末89差额或证明所有初始/后续计量。责任角色：交易会计/法务。关闭条件：按2025分类/年末各日期逐项连接净资产、估计售价、费用与准备；说明89差额及实际适用修订，避免五月信息倒填</w:t>
+        <w:t>P06 阅读新旧融资资源与定义</w:t>
+      </w:r>
+    </w:p>
+    <w:p>
+      <w:r>
+        <w:t>状态 performed；认定 披露一致性、计算准确性、期间及范围；总体 上述来源已明确定位的公开页面与表格，非企业交易总体；选取 围绕交易、四表及资金债务的针对性选取；不是统计审计抽样。</w:t>
+      </w:r>
+    </w:p>
+    <w:p>
+      <w:r>
+        <w:t>阅读年报债务表、契约报告和隔离实体说明</w:t>
+      </w:r>
+    </w:p>
+    <w:p>
+      <w:r>
+        <w:t>读新协议 §1.01、1.04、1.05、4.02、6.10，复核替代关系及提款约束</w:t>
+      </w:r>
+    </w:p>
+    <w:p>
+      <w:r>
+        <w:t>分开账面值、本金、旧未提额度、CP 备用占用及新信用证</w:t>
+      </w:r>
+    </w:p>
+    <w:p>
+      <w:r>
+        <w:t>补读2022 Amendment7附后旧协议指定定义及§1.04/1.05/6.09/6.10，与新原文分别核对</w:t>
+      </w:r>
+    </w:p>
+    <w:p>
+      <w:r>
+        <w:t>读2025年报和2026Q1附件索引、五月新8-K终止条款，有限检索截止前后续版本；无证据不推定不存在未公开修订</w:t>
+      </w:r>
+    </w:p>
+    <w:p>
+      <w:r>
+        <w:t>实际结果：旧新主信贷选定条款链现已补齐；旧待售例外和租赁/债务口径分别标明。内部缺口限数值调整、合规证明及非公开条款，未声称检查所有SPE票据契约。；证据 E25DEBT, E25COV, E25SPE, ECREDIT, C_oldnetavailability, C_newnetLC, EOLDCREDIT, EOLDVERSION, EQ126INDEX。</w:t>
       </w:r>
     </w:p>
     <w:p>
@@ -2953,17 +4408,27 @@
         <w:pStyle w:val="Heading2"/>
       </w:pPr>
       <w:r>
-        <w:t>Q03 待补资料</w:t>
-      </w:r>
-    </w:p>
-    <w:p>
-      <w:r>
-        <w:t>按法律实体的银行确认、受限现金、CP 备用额度、现金上划限制、未来逐月支出债务服务</w:t>
-      </w:r>
-    </w:p>
-    <w:p>
-      <w:r>
-        <w:t>影响：集团现金不等于法律母公司可动用资源，不能双算融资来源。责任角色：司库/法务。关闭条件：形成同一时点来源用途表、到期梯度与压力情境，分清承诺/限制/备用占用</w:t>
+        <w:t>P07 寻找不利证据</w:t>
+      </w:r>
+    </w:p>
+    <w:p>
+      <w:r>
+        <w:t>状态 performed；认定 披露一致性、计算准确性、期间及范围；总体 上述来源已明确定位的公开页面与表格，非企业交易总体；选取 围绕交易、四表及资金债务的针对性选取；不是统计审计抽样。</w:t>
+      </w:r>
+    </w:p>
+    <w:p>
+      <w:r>
+        <w:t>读 DISH 期后披露及现金/收入确认含义</w:t>
+      </w:r>
+    </w:p>
+    <w:p>
+      <w:r>
+        <w:t>将公司可收回判断与独立收款证据区分</w:t>
+      </w:r>
+    </w:p>
+    <w:p>
+      <w:r>
+        <w:t>实际结果：将应收收回风险作为反证；未进行法律或收款函证。；证据 EDISH。</w:t>
       </w:r>
     </w:p>
     <w:p>
@@ -2971,17 +4436,42 @@
         <w:pStyle w:val="Heading2"/>
       </w:pPr>
       <w:r>
-        <w:t>Q04 待补资料</w:t>
-      </w:r>
-    </w:p>
-    <w:p>
-      <w:r>
-        <w:t>已公开票据/SPE契约之外的未公开补充担保/现金限制、实际DSCR及现金陷阱合规证书、回收估值和估值输入</w:t>
-      </w:r>
-    </w:p>
-    <w:p>
-      <w:r>
-        <w:t>影响：公开契约的后续补读另见F06，不列为内部资料缺口；母公司主信用协议定义已读，但不替代每项SPE实际遵约与回收价值证据。责任角色：融资法务/司库。关闭条件：完成主体→债项法律及资金链，若需评级字母另选截止内正式方法并公开判断调整</w:t>
+        <w:t>P_SP 复核持续经营范围及跨会计和信用方法的调整桥</w:t>
+      </w:r>
+    </w:p>
+    <w:p>
+      <w:r>
+        <w:t>状态 performed；认定 完整性、分类、计算准确性、期间及范围；总体 所列官方年报、Q1披露、SEC原申报标签与S&amp;P相关条文；选取 按实际租赁、付息、股份支付、减记、ARO及客户事件取证，不是企业交易统计审计抽样。</w:t>
+      </w:r>
+    </w:p>
+    <w:p>
+      <w:r>
+        <w:t>核对原报附注默认持续经营范围及现金流剥离</w:t>
+      </w:r>
+    </w:p>
+    <w:p>
+      <w:r>
+        <w:t>核原SEC accession和InterestPaidNet定义，分别记录应计与现金资本化利息</w:t>
+      </w:r>
+    </w:p>
+    <w:p>
+      <w:r>
+        <w:t>阅读租赁/ARO/股份支付/软件及最佳估计条款并建立无重复加回的桥</w:t>
+      </w:r>
+    </w:p>
+    <w:p>
+      <w:r>
+        <w:t>从同一底稿执行确定性计算及案例专用方法桥，保留局部敏感性</w:t>
+      </w:r>
+    </w:p>
+    <w:p>
+      <w:r>
+        <w:t>核对Q1实际变化、续约表头及土地指标定义</w:t>
+      </w:r>
+    </w:p>
+    <w:p>
+      <w:r>
+        <w:t>实际结果：原报利息、DDA和ARO滚动勾稽，资本化现金与分类残余保留估计；不构成完整主体或债项评级。；证据 E_SP_RATIOS, E_SP_XBRL, E_SP_Q1CFO, E_SP_RENEW, E_SP_LAND, sp_ffo, C_sp_aro。</w:t>
       </w:r>
     </w:p>
     <w:p>
@@ -2989,17 +4479,17 @@
         <w:pStyle w:val="Heading2"/>
       </w:pPr>
       <w:r>
-        <w:t>Q05 待补资料</w:t>
-      </w:r>
-    </w:p>
-    <w:p>
-      <w:r>
-        <w:t>新旧已签合规证书、Borrower/Restricted Subsidiary总体及债务/合格现金/EBITDA逐项数值调整、出售及偿债备考底稿、实际限制性付款和未公开豁免</w:t>
-      </w:r>
-    </w:p>
-    <w:p>
-      <w:r>
-        <w:t>影响：公开新旧定义及会计备考已取得；缺按各适用版本执行的金额与证明，Article11净利润/节息不等于契约EBITDA。责任角色：司库/贷款代理行。关闭条件：分别按生效版本重建合规证书，验证待售例外/出售剔除及本金/租赁/现金调整、提款当日CP和条件，确认美元余量</w:t>
+        <w:t>Q01 待补资料</w:t>
+      </w:r>
+    </w:p>
+    <w:p>
+      <w:r>
+        <w:t>资产组/报告单元组织图、长期资产账面基数、未折现预测、商誉 DCF/市场法、税属性及敏感性</w:t>
+      </w:r>
+    </w:p>
+    <w:p>
+      <w:r>
+        <w:t>影响：不能从公司结论独立重做可收回性或公允价值。责任角色：财务估值/业务预算负责人。关闭条件：取得可追溯模型、董事会预算及实际回测，按正确顺序重做并解释余量</w:t>
       </w:r>
     </w:p>
     <w:p>
@@ -3007,17 +4497,17 @@
         <w:pStyle w:val="Heading2"/>
       </w:pPr>
       <w:r>
-        <w:t>Q06 待补资料</w:t>
-      </w:r>
-    </w:p>
-    <w:p>
-      <w:r>
-        <w:t>未公开的交割前估计表、实际124价调组成、最终结算表及尾款、银行收款/还款凭证、127备考估计与实际费用/留任支付及74已应计费用支付桥、四月新增投资</w:t>
-      </w:r>
-    </w:p>
-    <w:p>
-      <w:r>
-        <w:t>影响：公开8,500−124−127−2,002=6,247备考已取得；它不证明最终现金、实际还债时间或最终损益；最初合同机制不提供未公开结算数。责任角色：交易财务/司库。关闭条件：从实际交割凭证逐项连接最终价格、费用应计/支付及每笔偿债；确定后续修订影响。截止后材料另列验证层，不回填截止事实</w:t>
+        <w:t>Q02 待补资料</w:t>
+      </w:r>
+    </w:p>
+    <w:p>
+      <w:r>
+        <w:t>分类日内部会计备忘录、公开原件省略的ScheduleII/VI等附表及出售估值/费用明细、准备滚动；实际适用但未在已取得的公开原件找到的签署修订</w:t>
+      </w:r>
+    </w:p>
+    <w:p>
+      <w:r>
+        <w:t>影响：最初签署协议及§2.2–2.7机制已读；公开备考不能解释2025年末89差额或证明所有初始/后续计量。责任角色：交易会计/法务。关闭条件：按2025分类/年末各日期逐项连接净资产、估计售价、费用与准备；说明89差额及实际适用修订，避免五月信息倒填</w:t>
       </w:r>
     </w:p>
     <w:p>
@@ -3025,17 +4515,17 @@
         <w:pStyle w:val="Heading2"/>
       </w:pPr>
       <w:r>
-        <w:t>Q07 待补资料</w:t>
-      </w:r>
-    </w:p>
-    <w:p>
-      <w:r>
-        <w:t>原 2024 分部到重列持续/终止收入的逐项抵销与范围桥；2025 Q1 准备脚注差异正式解释</w:t>
-      </w:r>
-    </w:p>
-    <w:p>
-      <w:r>
-        <w:t>影响：两处公开版本算术不能无解释合并。责任角色：财务报告负责人。关闭条件：正式桥或更正分别解释两项差异，不将猜测写成事实</w:t>
+        <w:t>Q03 待补资料</w:t>
+      </w:r>
+    </w:p>
+    <w:p>
+      <w:r>
+        <w:t>按法律实体的银行确认、受限现金、CP 备用额度、现金上划限制、未来逐月支出债务服务</w:t>
+      </w:r>
+    </w:p>
+    <w:p>
+      <w:r>
+        <w:t>影响：集团现金不等于法律母公司可动用资源，不能双算融资来源。责任角色：司库/法务。关闭条件：形成同一时点来源用途表、到期梯度与压力情境，分清承诺/限制/备用占用</w:t>
       </w:r>
     </w:p>
     <w:p>
@@ -3043,6 +4533,78 @@
         <w:pStyle w:val="Heading2"/>
       </w:pPr>
       <w:r>
+        <w:t>Q04 待补资料</w:t>
+      </w:r>
+    </w:p>
+    <w:p>
+      <w:r>
+        <w:t>已公开票据/SPE契约之外的未公开补充担保/现金限制、实际DSCR及现金陷阱合规证书、回收估值和估值输入</w:t>
+      </w:r>
+    </w:p>
+    <w:p>
+      <w:r>
+        <w:t>影响：公开契约的后续补读另见F06，不列为内部资料缺口；母公司主信用协议定义已读，但不替代每项SPE实际遵约与回收价值证据。责任角色：融资法务/司库。关闭条件：完成主体→债项法律及资金链，若需评级字母另选截止内正式方法并公开判断调整</w:t>
+      </w:r>
+    </w:p>
+    <w:p>
+      <w:pPr>
+        <w:pStyle w:val="Heading2"/>
+      </w:pPr>
+      <w:r>
+        <w:t>Q05 待补资料</w:t>
+      </w:r>
+    </w:p>
+    <w:p>
+      <w:r>
+        <w:t>新旧已签合规证书、Borrower/Restricted Subsidiary总体及债务/合格现金/EBITDA逐项数值调整、出售及偿债备考底稿、实际限制性付款和未公开豁免</w:t>
+      </w:r>
+    </w:p>
+    <w:p>
+      <w:r>
+        <w:t>影响：公开新旧定义及会计备考已取得；缺按各适用版本执行的金额与证明，Article11净利润/节息不等于契约EBITDA。责任角色：司库/贷款代理行。关闭条件：分别按生效版本重建合规证书，验证待售例外/出售剔除及本金/租赁/现金调整、提款当日CP和条件，确认美元余量</w:t>
+      </w:r>
+    </w:p>
+    <w:p>
+      <w:pPr>
+        <w:pStyle w:val="Heading2"/>
+      </w:pPr>
+      <w:r>
+        <w:t>Q06 待补资料</w:t>
+      </w:r>
+    </w:p>
+    <w:p>
+      <w:r>
+        <w:t>未公开的交割前估计表、实际124价调组成、最终结算表及尾款、银行收款/还款凭证、127备考估计与实际费用/留任支付及74已应计费用支付桥、四月新增投资</w:t>
+      </w:r>
+    </w:p>
+    <w:p>
+      <w:r>
+        <w:t>影响：公开8,500−124−127−2,002=6,247备考已取得；它不证明最终现金、实际还债时间或最终损益；最初合同机制不提供未公开结算数。责任角色：交易财务/司库。关闭条件：从实际交割凭证逐项连接最终价格、费用应计/支付及每笔偿债；确定后续修订影响。截止后材料另列验证层，不回填截止事实</w:t>
+      </w:r>
+    </w:p>
+    <w:p>
+      <w:pPr>
+        <w:pStyle w:val="Heading2"/>
+      </w:pPr>
+      <w:r>
+        <w:t>Q07 待补资料</w:t>
+      </w:r>
+    </w:p>
+    <w:p>
+      <w:r>
+        <w:t>原 2024 分部到重列持续/终止收入的逐项抵销与范围桥；2025 Q1 准备脚注差异正式解释</w:t>
+      </w:r>
+    </w:p>
+    <w:p>
+      <w:r>
+        <w:t>影响：两处公开版本算术不能无解释合并。责任角色：财务报告负责人。关闭条件：正式桥或更正分别解释两项差异，不将猜测写成事实</w:t>
+      </w:r>
+    </w:p>
+    <w:p>
+      <w:pPr>
+        <w:pStyle w:val="Heading2"/>
+      </w:pPr>
+      <w:r>
         <w:t>Q08 待补资料</w:t>
       </w:r>
     </w:p>
@@ -3054,6 +4616,24 @@
     <w:p>
       <w:r>
         <w:t>影响：管理层可收回判断需要独立反证与收款支持。责任角色：法务/信用控制。关闭条件：按公开信息截止和法律实体区分已收、争议、预计收回及计量调整</w:t>
+      </w:r>
+    </w:p>
+    <w:p>
+      <w:pPr>
+        <w:pStyle w:val="Heading2"/>
+      </w:pPr>
+      <w:r>
+        <w:t>Q_SP 待补资料</w:t>
+      </w:r>
+    </w:p>
+    <w:p>
+      <w:r>
+        <w:t>资本化现金利息的结算拆分、股份支付非RSU差额的结算分类、PP&amp;E核销与净减记差额说明；ARO可用税益及专款抵减</w:t>
+      </w:r>
+    </w:p>
+    <w:p>
+      <w:r>
+        <w:t>影响：收窄实际存在的估计差额和评级临界性；965付息gross/net以及RSU已知部分无需重复索取。责任角色：资金、财务及税务负责人。关闭条件：逐项解释已识别差额，重新执行同一方法桥并评价聚合影响；不要求无关的全量内部资料才提供已有分析</w:t>
       </w:r>
     </w:p>
     <w:p>
@@ -3165,6 +4745,51 @@
     </w:p>
     <w:p>
       <w:r>
+        <w:t>[S_SP_Q4] Crown Castle Q4 2025 Supplemental Information；公布 2026-02-04</w:t>
+        <w:br/>
+        <w:t>https://investor.crowncastle.com/static-files/bea23792-6649-4b95-9395-aa837e68396c</w:t>
+        <w:br/>
+        <w:t>官方原件；S&amp;P日期为当前所用重发版，原发日期与阅读范围见对应证据；公司补充资料页码为PDF物理页。</w:t>
+      </w:r>
+    </w:p>
+    <w:p>
+      <w:r>
+        <w:t>[S_SP_Q1] Crown Castle Q1 2026 Supplemental Information；公布 2026-04-22</w:t>
+        <w:br/>
+        <w:t>https://investor.crowncastle.com/static-files/38f6a584-60a8-452d-bfd2-a44103aeec82</w:t>
+        <w:br/>
+        <w:t>官方原件；S&amp;P日期为当前所用重发版，原发日期与阅读范围见对应证据；公司补充资料页码为PDF物理页。</w:t>
+      </w:r>
+    </w:p>
+    <w:p>
+      <w:r>
+        <w:t>[S_SP_RATIOS] S&amp;P Corporate Methodology: Ratios And Adjustments；公布 2025-12-17</w:t>
+        <w:br/>
+        <w:t>https://www.maalot.co.il/Publications/MT20251223092257.pdf</w:t>
+        <w:br/>
+        <w:t>官方原件；S&amp;P日期为当前所用重发版，原发日期与阅读范围见对应证据；公司补充资料页码为PDF物理页。</w:t>
+      </w:r>
+    </w:p>
+    <w:p>
+      <w:r>
+        <w:t>[S_SP_SECTORS] S&amp;P Sector-Specific Corporate Methodology — Digital Infrastructure；公布 2025-09-26</w:t>
+        <w:br/>
+        <w:t>https://www.maalot.co.il/Publications/MT20251012123218.pdf</w:t>
+        <w:br/>
+        <w:t>官方原件；S&amp;P日期为当前所用重发版，原发日期与阅读范围见对应证据；公司补充资料页码为PDF物理页。</w:t>
+      </w:r>
+    </w:p>
+    <w:p>
+      <w:r>
+        <w:t>[S_SP_XBRL] SEC Companyfacts：Crown Castle 2025原申报事实；公布 2026-02-23</w:t>
+        <w:br/>
+        <w:t>https://data.sec.gov/api/xbrl/companyfacts/CIK0001051470.json</w:t>
+        <w:br/>
+        <w:t>API响应取得于2026-10-04；仅选accession 0001051470-26-000016、filed 2026-02-23、2025年度事实，未使用截止日后申报值。published为所选原申报公开日，非API快照取得日。</w:t>
+      </w:r>
+    </w:p>
+    <w:p>
+      <w:r>
         <w:t>[E25BS] S25 印刷及 PDF p58，Consolidated Balance Sheet，2025/2024 两列。资产、负债及权益四表组成行；比较列已按终止经营重列。 官方原件披露；阅读与复算不构成审计保证</w:t>
       </w:r>
     </w:p>
@@ -3331,6 +4956,66 @@
     <w:p>
       <w:r>
         <w:t>[EOLDVERSION] S25 Exhibit Index p101–102，Ex10.49–10.55，尤其2022 Amendment7。截至2025年报官方索引最后列明旧信贷2022-07-08 Amendment7；结合2026Q1索引和新信贷8-K终止披露、截止前官方定向搜索，所读范围未发现后续改变选定旧定义/门槛的提交文本。不能推定不存在未公开豁免。 官方公开原件；选定原文阅读与复算，不构成审计保证</w:t>
+      </w:r>
+    </w:p>
+    <w:p>
+      <w:r>
+        <w:t>[E_SP_RATIOS] S_SP_RATIOS 原发2019-04-01，2025-12-17重发，PDF7 ¶31–35；17–25 ¶86–137；44–45 ¶223–225。例行调整资料不完整时允许有依据的最佳估计；经营租赁同步调整债、EBITDA、利息和现金流；资本化现金利息重分类不改变FOCF；内部使用软件通常不反转。现金抵债不普遍扣最低运营预算，特殊受限现金按实际目的判断。 官方原件；按所列范围取证，估计及方法适用判断另标，不构成审计保证。</w:t>
+      </w:r>
+    </w:p>
+    <w:p>
+      <w:r>
+        <w:t>[E_SP_SCOPE] S25 note1/PDF及印刷p62；p60、p87–88。附注除特别说明外采用持续经营范围。合并CFO含终止经营，需剥离；补充现金付息、现金税和租赁支付按该附注范围解释。现金总计308不能全部作为可抵债现金。 官方原件；按所列范围取证，估计及方法适用判断另标，不构成审计保证。</w:t>
+      </w:r>
+    </w:p>
+    <w:p>
+      <w:r>
+        <w:t>[E_SP_LEASE] S25 PDF/印刷p58、p64、p75、p85、p87；note14。经营租赁成本599对应ROU，另有可变147，经营租赁实际付现519；期末经营租赁负债5229，贴现率5.2%。融资租赁折旧185已含690，融资租赁负债5已含金融债务；不能重复加回。 官方原件；按所列范围取证，估计及方法适用判断另标，不构成审计保证。</w:t>
+      </w:r>
+    </w:p>
+    <w:p>
+      <w:r>
+        <w:t>[E_SP_CASH] S25 PDF/印刷p68利息表；p87补充现金流。应计利息956、融资费摊销31、资本化15，净列费用972。现金付息965、现金税15，不能把所得税费用16或全部非现金利息当现金。资本化现金实付未单列，另作分析估计。 官方原件；按所列范围取证，估计及方法适用判断另标，不构成审计保证。</w:t>
+      </w:r>
+    </w:p>
+    <w:p>
+      <w:r>
+        <w:t>[E_SP_SBC] S25 PDF/印刷p59、p65、p83–84。持续经营股份支付73，其中每RSU对应一股普通股的费用61。PP&amp;E放弃和核销12、损益净减记行11，差1未解释；不得将权益变动157代替费用73。 官方原件；按所列范围取证，估计及方法适用判断另标，不构成审计保证。</w:t>
+      </w:r>
+    </w:p>
+    <w:p>
+      <w:r>
+        <w:t>[E_SP_ARO] S25 PDF/印刷p65、p73–74；p80–82税务。ARO301加增值25减结算4至322；折旧488、摊销177及ARO增值25合为690。未识别逐项税益/专款抵减，REIT身份不证明所有税益为零，也不能机械用21%。 官方原件；按所列范围取证，估计及方法适用判断另标，不构成审计保证。</w:t>
+      </w:r>
+    </w:p>
+    <w:p>
+      <w:r>
+        <w:t>[E_SP_XBRL] S_SP_XBRL facts/us-gaap/InterestPaidNet、InterestCostsCapitalized、AllocatedShareBasedCompensationExpense、ShareBasedCompensation；指定原申报accession。InterestPaidNet的2025值965百万美元，标签定义明确排除资本化利息且列经营活动。资本化利息15为发生额而非独立现金金额；73同时标为股份支付费用及非现金股份支付费用。 官方原件；按所列范围取证，估计及方法适用判断另标，不构成审计保证。</w:t>
+      </w:r>
+    </w:p>
+    <w:p>
+      <w:r>
+        <w:t>[E_SP_Q1CFO] SQ126 PDF6/印刷p5，2026Q1/2025Q1现金流表；PDF19–20/印刷p18–19，note13重组事项。合并CFO509/641，终止经营CFO213/270；比较期间均按同一持续经营范围剥离。2026重组计划费用14、已付12、未付2；2023/2024计划本季另付4、未付12。不能因公司非GAAP加回就从方法经营费用全部剔除。 官方原件；按所列范围取证，估计及方法适用判断另标，不构成审计保证。</w:t>
+      </w:r>
+    </w:p>
+    <w:p>
+      <w:r>
+        <w:t>[E_SP_Q1BILL] S_SP_Q1 PDF10/印刷p9：2026Q1列，Components of changes in site rental revenues。上年同期billings964；剔DISH及Sprint后的本期增量30，DISH终止影响‑49、Sprint不续约‑5，合为‑24。该非GAAP经营桥不是现金回款或IFRS/CAS收入。 官方原件；按所列范围取证，估计及方法适用判断另标，不构成审计保证。</w:t>
+      </w:r>
+    </w:p>
+    <w:p>
+      <w:r>
+        <w:t>[E_SP_RENEW] S_SP_Q4 PDF13/印刷p12；TENANT OVERVIEW及脚注(a)–(f)。客户合同平均剩余6年，AT&amp;T3年；2028续约组年度化现金租金861，其中AT&amp;T775。该表假设续约/延期，排除DISH，不是2028确定损失或当年现金到期额。 官方原件；按所列范围取证，估计及方法适用判断另标，不构成审计保证。</w:t>
+      </w:r>
+    </w:p>
+    <w:p>
+      <w:r>
+        <w:t>[E_SP_LAND] S_SP_Q4 PDF14/印刷p13：GROUND INTEREST OVERVIEW及脚注(e)–(i)。自有土地塔12045/39804，自有地块贡献末季年化站点租金毛现金利润1280/2999。租地加权剩余35年含续约选择权，与账内租赁15年、客户当前6年不可等同。 官方原件；按所列范围取证，估计及方法适用判断另标，不构成审计保证。</w:t>
+      </w:r>
+    </w:p>
+    <w:p>
+      <w:r>
+        <w:t>[E_SP_SECTORS] S_SP_SECTORS 2025-07-07原发、2025-09-26重发；PDF61–78数字基础设施章，尤其68–71及77。塔资产提供方与移动运营商付塔费不同。波动档要求业务风险、竞争地位及可预测CFO等共同条件，90%/2/3不是租赁收入比例。土地控制、客户质量和网络必要性可以缓释，但不能替代续约及违约压力。 官方原件；按所列范围取证，估计及方法适用判断另标，不构成审计保证。</w:t>
       </w:r>
     </w:p>
     <w:sectPr>
@@ -3351,7 +5036,7 @@
       <w:pStyle w:val="Footer"/>
     </w:pPr>
     <w:r>
-      <w:t xml:space="preserve">Crown Castle Inc. and subsidiaries  |  crown-castle-2025-public-1  |  </w:t>
+      <w:t xml:space="preserve">Crown Castle Inc. and subsidiaries  |  crown-castle-2025-public-2  |  </w:t>
     </w:r>
     <w:fldSimple w:instr="PAGE"/>
   </w:p>

</xml_diff>

<commit_message>
Add evidence-linked presentation briefs and refresh Crown example
</commit_message>
<xml_diff>
--- a/examples/crown-castle-2025/deliverables/report.docx
+++ b/examples/crown-castle-2025/deliverables/report.docx
@@ -12,7 +12,7 @@
     </w:p>
     <w:p>
       <w:r>
-        <w:t>2025-01-01 — 2025-12-31　资料截止 2026-06-30　底稿 crown-castle-2025-public-2</w:t>
+        <w:t>2025-01-01 — 2025-12-31　资料截止 2026-06-30　底稿 crown-castle-2025-public-3</w:t>
       </w:r>
     </w:p>
     <w:p>
@@ -1430,7 +1430,7 @@
             <w:r>
               <w:t>2025-12-31</w:t>
               <w:br/>
-              <w:t>590.00%</w:t>
+              <w:t>5.90 倍</w:t>
             </w:r>
           </w:p>
         </w:tc>
@@ -1533,7 +1533,7 @@
     </w:p>
     <w:p>
       <w:r>
-        <w:t>旧协议净杠杆 590.00% 对限额 650.00%，比率余量 60.00%；高级担保杠杆 20.00% 对 350.00%。</w:t>
+        <w:t>旧协议净杠杆 5.90 倍 对限额 6.50 倍，比率余量 0.60 倍；高级担保杠杆 0.20 倍 对 3.50 倍。</w:t>
       </w:r>
     </w:p>
     <w:p>
@@ -2212,7 +2212,7 @@
     </w:p>
     <w:p>
       <w:r>
-        <w:t>五月新循环承诺 4,500.00 百万USD 替代旧协议；扣生效时信用证 39.40 百万USD 后名义余额 4,460.60 百万USD，并非自由现金。总净杠杆限额改为 700.00%，旧利息保障条款移除。</w:t>
+        <w:t>五月新循环承诺 4,500.00 百万USD 替代旧协议；扣生效时信用证 39.40 百万USD 后名义余额 4,460.60 百万USD，并非自由现金。总净杠杆限额改为 7.00 倍，旧利息保障条款移除。</w:t>
       </w:r>
     </w:p>
     <w:p>
@@ -5036,7 +5036,7 @@
       <w:pStyle w:val="Footer"/>
     </w:pPr>
     <w:r>
-      <w:t xml:space="preserve">Crown Castle Inc. and subsidiaries  |  crown-castle-2025-public-2  |  </w:t>
+      <w:t xml:space="preserve">Crown Castle Inc. and subsidiaries  |  crown-castle-2025-public-3  |  </w:t>
     </w:r>
     <w:fldSimple w:instr="PAGE"/>
   </w:p>

</xml_diff>

<commit_message>
Correct Crown CICRA conditions and volatility sequence
</commit_message>
<xml_diff>
--- a/examples/crown-castle-2025/deliverables/report.docx
+++ b/examples/crown-castle-2025/deliverables/report.docx
@@ -17,37 +17,12 @@
     </w:p>
     <w:p>
       <w:r>
+        <w:t>对象：Crown Castle Inc. and subsidiaries。范围：合并报表；明确区分持续经营、终止经营及契约借款人口径。会计基础：US GAAP。</w:t>
+      </w:r>
+    </w:p>
+    <w:p>
+      <w:r>
         <w:t>通过四表、附注、出售协议及信用协议分析交易会计、现金资源和债务约束，形成可复算的公开资料研究成果。</w:t>
-      </w:r>
-    </w:p>
-    <w:p>
-      <w:r>
-        <w:t>方法与适用范围：下载官方 PDF，以 pypdf 提取；关键表逐页图像复核；原件 SHA-256 留存</w:t>
-      </w:r>
-    </w:p>
-    <w:p>
-      <w:r>
-        <w:t>方法与适用范围：仅采用截止日前公开原件；分别保留原报、重列比较期和期后事项，禁止跨期倒填</w:t>
-      </w:r>
-    </w:p>
-    <w:p>
-      <w:r>
-        <w:t>方法与适用范围：以共同底稿复算四表及交易调节；金额按原表百万美元记录，勾稽差额以美元列示</w:t>
-      </w:r>
-    </w:p>
-    <w:p>
-      <w:r>
-        <w:t>方法与适用范围：已执行程序仅为公开资料阅读、版本对照和计算；内部审计证据列为待核请求</w:t>
-      </w:r>
-    </w:p>
-    <w:p>
-      <w:r>
-        <w:t>方法与适用范围：读取出售备考、签署出售协议和新旧信贷定义，将备考假设、实际交割收付及尚未完成的计划分列。</w:t>
-      </w:r>
-    </w:p>
-    <w:p>
-      <w:r>
-        <w:t>方法与适用范围：按S&amp;P Ratios and Adjustments 2025-12-17及Sector-Specific Corporate Methodology 2025-09-26数字基础设施章建立历史调整桥和条件路径；方法代理、实际现金和分析估计分列。</w:t>
       </w:r>
     </w:p>
     <w:p>
@@ -75,7 +50,32 @@
     </w:p>
     <w:p>
       <w:r>
-        <w:t>范围：合并报表；明确区分持续经营、终止经营及契约借款人口径。会计基础：US GAAP。</w:t>
+        <w:t>方法与适用范围：下载官方 PDF，以 pypdf 提取；关键表逐页图像复核；原件 SHA-256 留存</w:t>
+      </w:r>
+    </w:p>
+    <w:p>
+      <w:r>
+        <w:t>方法与适用范围：仅采用截止日前公开原件；分别保留原报、重列比较期和期后事项，禁止跨期倒填</w:t>
+      </w:r>
+    </w:p>
+    <w:p>
+      <w:r>
+        <w:t>方法与适用范围：以共同底稿复算四表及交易调节；金额按原表百万美元记录，勾稽差额以美元列示</w:t>
+      </w:r>
+    </w:p>
+    <w:p>
+      <w:r>
+        <w:t>方法与适用范围：已执行程序仅为公开资料阅读、版本对照和计算；内部审计证据列为待核请求</w:t>
+      </w:r>
+    </w:p>
+    <w:p>
+      <w:r>
+        <w:t>方法与适用范围：读取出售备考、签署出售协议和新旧信贷定义，将备考假设、实际交割收付及尚未完成的计划分列。</w:t>
+      </w:r>
+    </w:p>
+    <w:p>
+      <w:r>
+        <w:t>方法与适用范围：按S&amp;P Ratios and Adjustments 2025-12-17及Sector-Specific Corporate Methodology 2025-09-26数字基础设施章建立历史调整桥和条件路径；方法代理、实际现金和分析估计分列。</w:t>
       </w:r>
     </w:p>
     <w:p>
@@ -2965,12 +2965,12 @@
     </w:p>
     <w:p>
       <w:r>
-        <w:t>自有土地覆盖30.26%的塔，贡献42.68%的末季年化毛现金利润。2028续约组年度化租金暴露中AT&amp;T占90.01%，该暴露不代表当年确定损失。长期租赁及续约经济性支持将medial列为待验证候选；若相应条件不满足则检验standard，不能预授low或直接输出等级。</w:t>
-      </w:r>
-    </w:p>
-    <w:p>
-      <w:r>
-        <w:t>租地35年含公司续约权、账内租赁15年、客户当前合同6年/AT&amp;T3年各有不同定义。土地控制和核心市场规模是正面证据，客户集中及DISH违约为反证。S&amp;P数字基础设施章低/中波动要求业务风险、竞争地位及至少90%/2/3可预测CFO等共同条件；收入占比不能替代CFO归属，客户短剩余期也不单独否定支持性框架路径。本案尚未独立完成CICRA、竞争地位、预测CFO及支持债项形成链，保留明确分支，不将保守标签视作已证实分类。</w:t>
+        <w:t>自有土地覆盖30.26%的塔，贡献42.68%的末季年化毛现金利润。2028续约组年度化租金暴露中AT&amp;T占90.01%，该暴露不代表当年确定损失。波动档先检验low的全部条件，再在low不成立时检验medial，均不成立才用standard。本案必要因素尚未完成，不给已确认波动档或等级。</w:t>
+      </w:r>
+    </w:p>
+    <w:p>
+      <w:r>
+        <w:t>Q4资料中的租地35年含公司续约权、账内租赁15年、客户合同6年/AT&amp;T3年各有不同定义。low要求CICRA为1或2、竞争地位至少strong、至少90%可预测CFO；可预测性可来自通常约10年剩余期且高度可能按相近条款续约的长期确定合同，或低政治干预风险的已建立支持性监管/合同/法律框架。low不成立时，medial要求CICRA为1至3、竞争地位至少satisfactory、至少2/3可预测CFO，来自续约风险有限或低的确定合同，或低政治干预风险的支持性监管/合同/法律框架。两档均要求其他活动不被视为高风险或具有波动性。收入占比不能替代CFO归属，客户短剩余期不单独否定框架路径；土地控制和核心市场规模是正面证据，客户集中及DISH违约为反证。尚未完成CICRA、竞争地位及前瞻现金归属，后续支持和债项也各有节点，不能把候选或保守标签视作已证分类。</w:t>
       </w:r>
     </w:p>
     <w:p>
@@ -5015,7 +5015,7 @@
     </w:p>
     <w:p>
       <w:r>
-        <w:t>[E_SP_SECTORS] S_SP_SECTORS 2025-07-07原发、2025-09-26重发；PDF61–78数字基础设施章，尤其68–71及77。塔资产提供方与移动运营商付塔费不同。波动档要求业务风险、竞争地位及可预测CFO等共同条件，90%/2/3不是租赁收入比例。土地控制、客户质量和网络必要性可以缓释，但不能替代续约及违约压力。 官方原件；按所列范围取证，估计及方法适用判断另标，不构成审计保证。</w:t>
+        <w:t>[E_SP_SECTORS] S_SP_SECTORS 2025-07-07原发、2025-09-26重发；PDF61–78数字基础设施章，尤其68–71及77。塔资产提供方与移动运营商付塔费不同。先检验low，再在low不成立时检验medial，均不成立才用standard。low要求CICRA为1或2、竞争地位至少strong、至少90%可预测CFO；medial要求CICRA为1至3、竞争地位至少satisfactory、至少2/3可预测CFO。两档分别核合同或支持性监管/合同/法律框架条件，low的框架还须已建立，并均要求其他活动不被视为高风险或具有波动性；收入占比不能替代CFO归属。 官方原件；按所列范围取证，估计及方法适用判断另标，不构成审计保证。</w:t>
       </w:r>
     </w:p>
     <w:sectPr>

</xml_diff>